<commit_message>
Add academic self-reference in CIET 2026 full paper
</commit_message>
<xml_diff>
--- a/CIET-2026/Implementation of WebRTC in Real-time Communication Applications.docx
+++ b/CIET-2026/Implementation of WebRTC in Real-time Communication Applications.docx
@@ -506,12 +506,12 @@
           <wp:inline distB="114300" distT="114300" distL="114300" distR="114300">
             <wp:extent cx="3686175" cy="2431322"/>
             <wp:effectExtent b="0" l="0" r="0" t="0"/>
-            <wp:docPr id="16" name="image5.png"/>
+            <wp:docPr id="16" name="image2.png"/>
             <a:graphic>
               <a:graphicData uri="http://schemas.openxmlformats.org/drawingml/2006/picture">
                 <pic:pic>
                   <pic:nvPicPr>
-                    <pic:cNvPr id="0" name="image5.png"/>
+                    <pic:cNvPr id="0" name="image2.png"/>
                     <pic:cNvPicPr preferRelativeResize="0"/>
                   </pic:nvPicPr>
                   <pic:blipFill>
@@ -583,7 +583,7 @@
         <w:rPr>
           <w:rtl w:val="0"/>
         </w:rPr>
-        <w:t xml:space="preserve">It emerged as an attempt to integrate real-time speech and video technologies, which were previously closed and proprietary, directly into web browsers as an open standard. Google acquired the company Global IP Solutions (GIPS) in 2010 and released the code for their RTC components under the open BSD license, which was a key step in the development of WebRTC. Subsequently, Google launched the WebRTC project in 2011, and standardization took several years, requiring significant efforts and collaboration between two standardization bodies: W3C (World Wide Web Consortium) and IETF (Internet Engineering Task Force) </w:t>
+        <w:t xml:space="preserve">It emerged as an attempt to integrate real-time speech and video technologies, which were previously closed and proprietary, directly into web browsers as an open standard. Google acquired the company Global IP Solutions (GIPS) in 2010 and released the code for their RTC components under the open BSD license, which was a key step in the development of WebRTC. Subsequently, Google launched the WebRTC project in 2011, and standardization took several years, requiring significant efforts and collaboration between two standardization bodies: W3C (World Wide Web Consortium) and IETF (Internet Engineering Task Force), as well as a large number of companies and individuals from the industry </w:t>
       </w:r>
       <w:hyperlink w:anchor="436lt588xhm">
         <w:r>
@@ -597,7 +597,13 @@
         <w:rPr>
           <w:rtl w:val="0"/>
         </w:rPr>
-        <w:t xml:space="preserve">, as well as a large number of companies and individuals from the industry. In addition to Google, companies such as Mozilla, Microsoft, Apple, Intel Corporation, Cisco, and Ericsson participated in the development of specifications and implementation, and support was gradually introduced in all modern web browsers, making WebRTC the standard mechanism for in-browser audio-video communication.</w:t>
+        <w:t xml:space="preserve">. </w:t>
+      </w:r>
+      <w:r>
+        <w:rPr>
+          <w:rtl w:val="0"/>
+        </w:rPr>
+        <w:t xml:space="preserve">In addition to Google, companies such as Mozilla, Microsoft, Apple, Intel Corporation, Cisco, and Ericsson participated in the development of specifications and implementation, and support was gradually introduced in all modern web browsers, making WebRTC the standard mechanism for in-browser audio-video communication.</w:t>
         <w:br w:type="textWrapping"/>
         <w:tab/>
         <w:t xml:space="preserve">Today, it is applied in a wide range of applications, from video conferencing to online games, remote control, IoT (Internet of Things) communication, and other scenarios that require low latency and high transmission quality.</w:t>
@@ -711,12 +717,12 @@
           <wp:inline distB="114300" distT="114300" distL="114300" distR="114300">
             <wp:extent cx="2111400" cy="540000"/>
             <wp:effectExtent b="0" l="0" r="0" t="0"/>
-            <wp:docPr id="18" name="image9.png"/>
+            <wp:docPr id="18" name="image7.png"/>
             <a:graphic>
               <a:graphicData uri="http://schemas.openxmlformats.org/drawingml/2006/picture">
                 <pic:pic>
                   <pic:nvPicPr>
-                    <pic:cNvPr id="0" name="image9.png"/>
+                    <pic:cNvPr id="0" name="image7.png"/>
                     <pic:cNvPicPr preferRelativeResize="0"/>
                   </pic:nvPicPr>
                   <pic:blipFill>
@@ -808,12 +814,12 @@
           <wp:inline distB="0" distT="0" distL="114300" distR="114300">
             <wp:extent cx="3038475" cy="908294"/>
             <wp:effectExtent b="0" l="0" r="0" t="0"/>
-            <wp:docPr id="23" name="image8.png"/>
+            <wp:docPr id="23" name="image9.png"/>
             <a:graphic>
               <a:graphicData uri="http://schemas.openxmlformats.org/drawingml/2006/picture">
                 <pic:pic>
                   <pic:nvPicPr>
-                    <pic:cNvPr id="0" name="image8.png"/>
+                    <pic:cNvPr id="0" name="image9.png"/>
                     <pic:cNvPicPr preferRelativeResize="0"/>
                   </pic:nvPicPr>
                   <pic:blipFill>
@@ -849,12 +855,12 @@
           <wp:inline distB="0" distT="0" distL="114300" distR="114300">
             <wp:extent cx="2619375" cy="1229549"/>
             <wp:effectExtent b="0" l="0" r="0" t="0"/>
-            <wp:docPr id="14" name="image2.png"/>
+            <wp:docPr id="14" name="image5.png"/>
             <a:graphic>
               <a:graphicData uri="http://schemas.openxmlformats.org/drawingml/2006/picture">
                 <pic:pic>
                   <pic:nvPicPr>
-                    <pic:cNvPr id="0" name="image2.png"/>
+                    <pic:cNvPr id="0" name="image5.png"/>
                     <pic:cNvPicPr preferRelativeResize="0"/>
                   </pic:nvPicPr>
                   <pic:blipFill>
@@ -956,12 +962,12 @@
           <wp:inline distB="114300" distT="114300" distL="114300" distR="114300">
             <wp:extent cx="4233600" cy="1080000"/>
             <wp:effectExtent b="0" l="0" r="0" t="0"/>
-            <wp:docPr id="22" name="image11.png"/>
+            <wp:docPr id="22" name="image3.png"/>
             <a:graphic>
               <a:graphicData uri="http://schemas.openxmlformats.org/drawingml/2006/picture">
                 <pic:pic>
                   <pic:nvPicPr>
-                    <pic:cNvPr id="0" name="image11.png"/>
+                    <pic:cNvPr id="0" name="image3.png"/>
                     <pic:cNvPicPr preferRelativeResize="0"/>
                   </pic:nvPicPr>
                   <pic:blipFill>
@@ -1032,12 +1038,12 @@
           <wp:inline distB="114300" distT="114300" distL="114300" distR="114300">
             <wp:extent cx="4915823" cy="1076325"/>
             <wp:effectExtent b="0" l="0" r="0" t="0"/>
-            <wp:docPr id="24" name="image12.png"/>
+            <wp:docPr id="24" name="image15.png"/>
             <a:graphic>
               <a:graphicData uri="http://schemas.openxmlformats.org/drawingml/2006/picture">
                 <pic:pic>
                   <pic:nvPicPr>
-                    <pic:cNvPr id="0" name="image12.png"/>
+                    <pic:cNvPr id="0" name="image15.png"/>
                     <pic:cNvPicPr preferRelativeResize="0"/>
                   </pic:nvPicPr>
                   <pic:blipFill>
@@ -1206,12 +1212,12 @@
           <wp:inline distB="114300" distT="114300" distL="114300" distR="114300">
             <wp:extent cx="3398400" cy="2880000"/>
             <wp:effectExtent b="0" l="0" r="0" t="0"/>
-            <wp:docPr id="11" name="image1.png"/>
+            <wp:docPr id="11" name="image11.png"/>
             <a:graphic>
               <a:graphicData uri="http://schemas.openxmlformats.org/drawingml/2006/picture">
                 <pic:pic>
                   <pic:nvPicPr>
-                    <pic:cNvPr id="0" name="image1.png"/>
+                    <pic:cNvPr id="0" name="image11.png"/>
                     <pic:cNvPicPr preferRelativeResize="0"/>
                   </pic:nvPicPr>
                   <pic:blipFill>
@@ -1280,7 +1286,7 @@
           <w:rPr>
             <w:rtl w:val="0"/>
           </w:rPr>
-          <w:t xml:space="preserve">[8]</w:t>
+          <w:t xml:space="preserve">[9]</w:t>
         </w:r>
       </w:hyperlink>
       <w:r>
@@ -1294,7 +1300,7 @@
           <w:rPr>
             <w:rtl w:val="0"/>
           </w:rPr>
-          <w:t xml:space="preserve">[9]</w:t>
+          <w:t xml:space="preserve">[10]</w:t>
         </w:r>
       </w:hyperlink>
       <w:r>
@@ -1347,12 +1353,12 @@
           <wp:inline distB="114300" distT="114300" distL="114300" distR="114300">
             <wp:extent cx="2053350" cy="3240000"/>
             <wp:effectExtent b="0" l="0" r="0" t="0"/>
-            <wp:docPr id="12" name="image7.png"/>
+            <wp:docPr id="12" name="image13.png"/>
             <a:graphic>
               <a:graphicData uri="http://schemas.openxmlformats.org/drawingml/2006/picture">
                 <pic:pic>
                   <pic:nvPicPr>
-                    <pic:cNvPr id="0" name="image7.png"/>
+                    <pic:cNvPr id="0" name="image13.png"/>
                     <pic:cNvPicPr preferRelativeResize="0"/>
                   </pic:nvPicPr>
                   <pic:blipFill>
@@ -1412,7 +1418,7 @@
     </w:p>
     <w:p>
       <w:pPr>
-        <w:ind w:firstLine="720"/>
+        <w:ind w:left="0" w:firstLine="720"/>
         <w:rPr/>
       </w:pPr>
       <w:r>
@@ -1426,7 +1432,7 @@
           <w:rPr>
             <w:rtl w:val="0"/>
           </w:rPr>
-          <w:t xml:space="preserve">[6]</w:t>
+          <w:t xml:space="preserve">[7]</w:t>
         </w:r>
       </w:hyperlink>
       <w:r>
@@ -1462,7 +1468,7 @@
           <w:rPr>
             <w:rtl w:val="0"/>
           </w:rPr>
-          <w:t xml:space="preserve">[7]</w:t>
+          <w:t xml:space="preserve">[8]</w:t>
         </w:r>
       </w:hyperlink>
       <w:r>
@@ -1491,7 +1497,7 @@
           <w:rPr>
             <w:rtl w:val="0"/>
           </w:rPr>
-          <w:t xml:space="preserve">[10]</w:t>
+          <w:t xml:space="preserve">[11]</w:t>
         </w:r>
       </w:hyperlink>
       <w:r>
@@ -1505,7 +1511,7 @@
           <w:rPr>
             <w:rtl w:val="0"/>
           </w:rPr>
-          <w:t xml:space="preserve">[11]</w:t>
+          <w:t xml:space="preserve">[12]</w:t>
         </w:r>
       </w:hyperlink>
       <w:r>
@@ -1545,7 +1551,27 @@
         <w:rPr>
           <w:rtl w:val="0"/>
         </w:rPr>
-        <w:t xml:space="preserve">The practical part of this paper is a web application that connects students and tutors, facilitating the organization and management of online and onsite tutoring sessions. The application enables students to easily find and book tutoring sessions, while tutors can efficiently manage their own schedules, offers, and bookings. Participation in online tutoring sessions is supported by integration of peer-to-peer WebRTC technology for video calls. The full-stack web application was developed in the React development framework Next.js, while a relational PostgreSQL database managed via Prisma ORM and hosted on the Supabase platform is used for data storage.</w:t>
+        <w:t xml:space="preserve">This section presents WebRTC implementation within the tutoring web application developed in </w:t>
+      </w:r>
+      <w:hyperlink w:anchor="edet4881e1gr">
+        <w:r>
+          <w:rPr>
+            <w:rtl w:val="0"/>
+          </w:rPr>
+          <w:t xml:space="preserve">[6]</w:t>
+        </w:r>
+      </w:hyperlink>
+      <w:r>
+        <w:rPr>
+          <w:rtl w:val="0"/>
+        </w:rPr>
+        <w:t xml:space="preserve"> </w:t>
+      </w:r>
+      <w:r>
+        <w:rPr>
+          <w:rtl w:val="0"/>
+        </w:rPr>
+        <w:t xml:space="preserve">that connects students and tutors, facilitating the organization and management of online and onsite tutoring sessions. The application enables students to easily find and book tutoring sessions, while tutors can efficiently manage their own schedules, offers, and bookings. Participation in online tutoring sessions is supported by integration of peer-to-peer WebRTC technology for video calls. The full-stack web application was developed in the React development framework Next.js, while a relational PostgreSQL database managed via Prisma ORM and hosted on the Supabase platform is used for data storage.</w:t>
         <w:br w:type="textWrapping"/>
         <w:tab/>
         <w:t xml:space="preserve">Since WebRTC does not specify the signaling method, this application uses the real-time functionalities of the Supabase platform as the signaling channel. This means that the messages needed to establish the connection are exchanged via the Supabase real-time channel, while the media streams themselves (audio and video) are established directly between participants' browsers after agreeing on the parameters. In this way, the data layer (Supabase/PostgreSQL) and the communication layer (WebRTC) are integrated into a whole — Supabase ensures reliable and scalable exchange of signaling messages, while WebRTC handles real-time multimedia transmission.</w:t>
@@ -1590,14 +1616,14 @@
         <w:rPr/>
         <w:drawing>
           <wp:inline distB="114300" distT="114300" distL="114300" distR="114300">
-            <wp:extent cx="5864400" cy="1800000"/>
+            <wp:extent cx="5760000" cy="1767600"/>
             <wp:effectExtent b="0" l="0" r="0" t="0"/>
-            <wp:docPr id="15" name="image4.png"/>
+            <wp:docPr id="15" name="image8.png"/>
             <a:graphic>
               <a:graphicData uri="http://schemas.openxmlformats.org/drawingml/2006/picture">
                 <pic:pic>
                   <pic:nvPicPr>
-                    <pic:cNvPr id="0" name="image4.png"/>
+                    <pic:cNvPr id="0" name="image8.png"/>
                     <pic:cNvPicPr preferRelativeResize="0"/>
                   </pic:nvPicPr>
                   <pic:blipFill>
@@ -1610,7 +1636,7 @@
                   <pic:spPr>
                     <a:xfrm>
                       <a:off x="0" y="0"/>
-                      <a:ext cx="5864400" cy="1800000"/>
+                      <a:ext cx="5760000" cy="1767600"/>
                     </a:xfrm>
                     <a:prstGeom prst="rect"/>
                     <a:ln/>
@@ -1812,7 +1838,7 @@
           <w:rPr>
             <w:rtl w:val="0"/>
           </w:rPr>
-          <w:t xml:space="preserve">[12]</w:t>
+          <w:t xml:space="preserve">[13]</w:t>
         </w:r>
       </w:hyperlink>
       <w:r>
@@ -1964,20 +1990,6 @@
             <w:rtl w:val="0"/>
           </w:rPr>
           <w:t xml:space="preserve">1</w:t>
-        </w:r>
-      </w:hyperlink>
-      <w:r>
-        <w:rPr>
-          <w:rtl w:val="0"/>
-        </w:rPr>
-        <w:t xml:space="preserve"> </w:t>
-      </w:r>
-      <w:hyperlink w:anchor="jjc2ee9pyi1w">
-        <w:r>
-          <w:rPr>
-            <w:rtl w:val="0"/>
-          </w:rPr>
-          <w:t xml:space="preserve">[13]</w:t>
         </w:r>
       </w:hyperlink>
       <w:r>
@@ -2759,20 +2771,6 @@
         <w:rPr>
           <w:rtl w:val="0"/>
         </w:rPr>
-        <w:t xml:space="preserve"> </w:t>
-      </w:r>
-      <w:hyperlink w:anchor="436lt588xhm">
-        <w:r>
-          <w:rPr>
-            <w:rtl w:val="0"/>
-          </w:rPr>
-          <w:t xml:space="preserve">[14]</w:t>
-        </w:r>
-      </w:hyperlink>
-      <w:r>
-        <w:rPr>
-          <w:rtl w:val="0"/>
-        </w:rPr>
         <w:t xml:space="preserve">:</w:t>
       </w:r>
     </w:p>
@@ -9749,12 +9747,12 @@
               <wp:inline distB="114300" distT="114300" distL="114300" distR="114300">
                 <wp:extent cx="5759140" cy="1018385"/>
                 <wp:effectExtent b="0" l="0" r="0" t="0"/>
-                <wp:docPr id="1" name="image15.png"/>
+                <wp:docPr id="1" name="image14.png"/>
                 <a:graphic>
                   <a:graphicData uri="http://schemas.openxmlformats.org/drawingml/2006/picture">
                     <pic:pic>
                       <pic:nvPicPr>
-                        <pic:cNvPr id="0" name="image15.png"/>
+                        <pic:cNvPr id="0" name="image14.png"/>
                         <pic:cNvPicPr preferRelativeResize="0"/>
                       </pic:nvPicPr>
                       <pic:blipFill>
@@ -14014,12 +14012,12 @@
           <wp:inline distB="0" distT="0" distL="114300" distR="114300">
             <wp:extent cx="2905125" cy="2470687"/>
             <wp:effectExtent b="0" l="0" r="0" t="0"/>
-            <wp:docPr id="21" name="image10.png"/>
+            <wp:docPr id="21" name="image12.png"/>
             <a:graphic>
               <a:graphicData uri="http://schemas.openxmlformats.org/drawingml/2006/picture">
                 <pic:pic>
                   <pic:nvPicPr>
-                    <pic:cNvPr id="0" name="image10.png"/>
+                    <pic:cNvPr id="0" name="image12.png"/>
                     <pic:cNvPicPr preferRelativeResize="0"/>
                   </pic:nvPicPr>
                   <pic:blipFill>
@@ -14055,12 +14053,12 @@
           <wp:inline distB="0" distT="0" distL="114300" distR="114300">
             <wp:extent cx="1647825" cy="2946937"/>
             <wp:effectExtent b="0" l="0" r="0" t="0"/>
-            <wp:docPr id="13" name="image6.jpg"/>
+            <wp:docPr id="13" name="image4.jpg"/>
             <a:graphic>
               <a:graphicData uri="http://schemas.openxmlformats.org/drawingml/2006/picture">
                 <pic:pic>
                   <pic:nvPicPr>
-                    <pic:cNvPr id="0" name="image6.jpg"/>
+                    <pic:cNvPr id="0" name="image4.jpg"/>
                     <pic:cNvPicPr preferRelativeResize="0"/>
                   </pic:nvPicPr>
                   <pic:blipFill>
@@ -14161,7 +14159,7 @@
         <w:rPr>
           <w:rtl w:val="0"/>
         </w:rPr>
-        <w:t xml:space="preserve">Figure </w:t>
+        <w:t xml:space="preserve">Figures </w:t>
       </w:r>
       <w:hyperlink w:anchor="vgv04f5oihl1">
         <w:r>
@@ -14210,12 +14208,12 @@
           <wp:inline distB="114300" distT="114300" distL="114300" distR="114300">
             <wp:extent cx="5076000" cy="3600000"/>
             <wp:effectExtent b="0" l="0" r="0" t="0"/>
-            <wp:docPr id="17" name="image13.png"/>
+            <wp:docPr id="17" name="image10.png"/>
             <a:graphic>
               <a:graphicData uri="http://schemas.openxmlformats.org/drawingml/2006/picture">
                 <pic:pic>
                   <pic:nvPicPr>
-                    <pic:cNvPr id="0" name="image13.png"/>
+                    <pic:cNvPr id="0" name="image10.png"/>
                     <pic:cNvPicPr preferRelativeResize="0"/>
                   </pic:nvPicPr>
                   <pic:blipFill>
@@ -14309,12 +14307,12 @@
           <wp:inline distB="0" distT="0" distL="114300" distR="114300">
             <wp:extent cx="2238375" cy="4401875"/>
             <wp:effectExtent b="0" l="0" r="0" t="0"/>
-            <wp:docPr id="19" name="image14.jpg"/>
+            <wp:docPr id="19" name="image1.jpg"/>
             <a:graphic>
               <a:graphicData uri="http://schemas.openxmlformats.org/drawingml/2006/picture">
                 <pic:pic>
                   <pic:nvPicPr>
-                    <pic:cNvPr id="0" name="image14.jpg"/>
+                    <pic:cNvPr id="0" name="image1.jpg"/>
                     <pic:cNvPicPr preferRelativeResize="0"/>
                   </pic:nvPicPr>
                   <pic:blipFill>
@@ -14344,12 +14342,12 @@
           <wp:inline distB="0" distT="0" distL="114300" distR="114300">
             <wp:extent cx="2062800" cy="4320000"/>
             <wp:effectExtent b="0" l="0" r="0" t="0"/>
-            <wp:docPr id="20" name="image3.jpg"/>
+            <wp:docPr id="20" name="image6.jpg"/>
             <a:graphic>
               <a:graphicData uri="http://schemas.openxmlformats.org/drawingml/2006/picture">
                 <pic:pic>
                   <pic:nvPicPr>
-                    <pic:cNvPr id="0" name="image3.jpg"/>
+                    <pic:cNvPr id="0" name="image6.jpg"/>
                     <pic:cNvPicPr preferRelativeResize="0"/>
                   </pic:nvPicPr>
                   <pic:blipFill>
@@ -14731,7 +14729,7 @@
         </w:rPr>
       </w:r>
     </w:p>
-    <w:bookmarkStart w:colFirst="0" w:colLast="0" w:name="771efax98nz4" w:id="37"/>
+    <w:bookmarkStart w:colFirst="0" w:colLast="0" w:name="edet4881e1gr" w:id="37"/>
     <w:bookmarkEnd w:id="37"/>
     <w:p>
       <w:pPr>
@@ -14743,6 +14741,7 @@
         <w:rPr>
           <w:sz w:val="22"/>
           <w:szCs w:val="22"/>
+          <w:u w:val="none"/>
         </w:rPr>
       </w:pPr>
       <w:r>
@@ -14751,9 +14750,47 @@
           <w:szCs w:val="22"/>
           <w:rtl w:val="0"/>
         </w:rPr>
+        <w:t xml:space="preserve">Papić, A. (2026). Razvoj web aplikacije za repeticije. Diplomski rad. Sveučilište u Splitu, Sveučilišni odjel za stručne studije, Split. </w:t>
+      </w:r>
+      <w:hyperlink r:id="rId27">
+        <w:r>
+          <w:rPr>
+            <w:sz w:val="22"/>
+            <w:szCs w:val="22"/>
+            <w:rtl w:val="0"/>
+          </w:rPr>
+          <w:t xml:space="preserve">https://urn.nsk.hr/urn:nbn:hr:228:949522</w:t>
+        </w:r>
+      </w:hyperlink>
+      <w:r>
+        <w:rPr>
+          <w:rtl w:val="0"/>
+        </w:rPr>
+      </w:r>
+    </w:p>
+    <w:bookmarkStart w:colFirst="0" w:colLast="0" w:name="771efax98nz4" w:id="38"/>
+    <w:bookmarkEnd w:id="38"/>
+    <w:p>
+      <w:pPr>
+        <w:numPr>
+          <w:ilvl w:val="0"/>
+          <w:numId w:val="1"/>
+        </w:numPr>
+        <w:ind w:left="720" w:hanging="360"/>
+        <w:rPr>
+          <w:sz w:val="22"/>
+          <w:szCs w:val="22"/>
+        </w:rPr>
+      </w:pPr>
+      <w:r>
+        <w:rPr>
+          <w:sz w:val="22"/>
+          <w:szCs w:val="22"/>
+          <w:rtl w:val="0"/>
+        </w:rPr>
         <w:t xml:space="preserve">Rescorla, E., &amp; Modadugu, N. (2012). Datagram Transport Layer Security Version 1.2 (RFC 6347). </w:t>
       </w:r>
-      <w:hyperlink r:id="rId27">
+      <w:hyperlink r:id="rId28">
         <w:r>
           <w:rPr>
             <w:sz w:val="22"/>
@@ -14769,8 +14806,8 @@
         </w:rPr>
       </w:r>
     </w:p>
-    <w:bookmarkStart w:colFirst="0" w:colLast="0" w:name="3elz847hzigg" w:id="38"/>
-    <w:bookmarkEnd w:id="38"/>
+    <w:bookmarkStart w:colFirst="0" w:colLast="0" w:name="3elz847hzigg" w:id="39"/>
+    <w:bookmarkEnd w:id="39"/>
     <w:p>
       <w:pPr>
         <w:numPr>
@@ -14791,7 +14828,7 @@
         </w:rPr>
         <w:t xml:space="preserve">Rescorla, E., et al. (2022). The WebRTC Security Architecture (RFC 9143). </w:t>
       </w:r>
-      <w:hyperlink r:id="rId28">
+      <w:hyperlink r:id="rId29">
         <w:r>
           <w:rPr>
             <w:sz w:val="22"/>
@@ -14807,8 +14844,8 @@
         </w:rPr>
       </w:r>
     </w:p>
-    <w:bookmarkStart w:colFirst="0" w:colLast="0" w:name="u10sn56o268o" w:id="39"/>
-    <w:bookmarkEnd w:id="39"/>
+    <w:bookmarkStart w:colFirst="0" w:colLast="0" w:name="u10sn56o268o" w:id="40"/>
+    <w:bookmarkEnd w:id="40"/>
     <w:p>
       <w:pPr>
         <w:numPr>
@@ -14829,7 +14866,7 @@
         </w:rPr>
         <w:t xml:space="preserve">Rosenberg, J., Mahy, R., &amp; Wing, D. (2010). Interactive Connectivity Establishment (ICE) (RFC 5245). </w:t>
       </w:r>
-      <w:hyperlink r:id="rId29">
+      <w:hyperlink r:id="rId30">
         <w:r>
           <w:rPr>
             <w:sz w:val="22"/>
@@ -14845,8 +14882,8 @@
         </w:rPr>
       </w:r>
     </w:p>
-    <w:bookmarkStart w:colFirst="0" w:colLast="0" w:name="tboo8a6eh01h" w:id="40"/>
-    <w:bookmarkEnd w:id="40"/>
+    <w:bookmarkStart w:colFirst="0" w:colLast="0" w:name="tboo8a6eh01h" w:id="41"/>
+    <w:bookmarkEnd w:id="41"/>
     <w:p>
       <w:pPr>
         <w:numPr>
@@ -14867,7 +14904,7 @@
         </w:rPr>
         <w:t xml:space="preserve">Rosenberg, J., Mahy, R., Matthews, P., &amp; Wing, D. (2010). Session Traversal Utilities for NAT (STUN) (RFC 5389). </w:t>
       </w:r>
-      <w:hyperlink r:id="rId30">
+      <w:hyperlink r:id="rId31">
         <w:r>
           <w:rPr>
             <w:sz w:val="22"/>
@@ -14883,8 +14920,8 @@
         </w:rPr>
       </w:r>
     </w:p>
-    <w:bookmarkStart w:colFirst="0" w:colLast="0" w:name="owyroi7qj1u8" w:id="41"/>
-    <w:bookmarkEnd w:id="41"/>
+    <w:bookmarkStart w:colFirst="0" w:colLast="0" w:name="owyroi7qj1u8" w:id="42"/>
+    <w:bookmarkEnd w:id="42"/>
     <w:p>
       <w:pPr>
         <w:numPr>
@@ -14905,7 +14942,7 @@
         </w:rPr>
         <w:t xml:space="preserve">Schulzrinne, H., Casner, S., Frederick, R., &amp; Jacobson, V. (2003). RTP: A Transport Protocol for Real-Time Applications (RFC 3550). </w:t>
       </w:r>
-      <w:hyperlink r:id="rId31">
+      <w:hyperlink r:id="rId32">
         <w:r>
           <w:rPr>
             <w:sz w:val="22"/>
@@ -14921,45 +14958,7 @@
         </w:rPr>
       </w:r>
     </w:p>
-    <w:bookmarkStart w:colFirst="0" w:colLast="0" w:name="pubx4x9yx3oz" w:id="42"/>
-    <w:bookmarkEnd w:id="42"/>
-    <w:p>
-      <w:pPr>
-        <w:numPr>
-          <w:ilvl w:val="0"/>
-          <w:numId w:val="1"/>
-        </w:numPr>
-        <w:ind w:left="720" w:hanging="360"/>
-        <w:rPr>
-          <w:sz w:val="22"/>
-          <w:szCs w:val="22"/>
-        </w:rPr>
-      </w:pPr>
-      <w:r>
-        <w:rPr>
-          <w:sz w:val="22"/>
-          <w:szCs w:val="22"/>
-          <w:rtl w:val="0"/>
-        </w:rPr>
-        <w:t xml:space="preserve">Stewart, R. (2007). Stream Control Transmission Protocol (RFC 4960). </w:t>
-      </w:r>
-      <w:hyperlink r:id="rId32">
-        <w:r>
-          <w:rPr>
-            <w:sz w:val="22"/>
-            <w:szCs w:val="22"/>
-            <w:rtl w:val="0"/>
-          </w:rPr>
-          <w:t xml:space="preserve">https://www.rfc-editor.org/rfc/rfc4960</w:t>
-        </w:r>
-      </w:hyperlink>
-      <w:r>
-        <w:rPr>
-          <w:rtl w:val="0"/>
-        </w:rPr>
-      </w:r>
-    </w:p>
-    <w:bookmarkStart w:colFirst="0" w:colLast="0" w:name="x501v9ofrj6a" w:id="43"/>
+    <w:bookmarkStart w:colFirst="0" w:colLast="0" w:name="pubx4x9yx3oz" w:id="43"/>
     <w:bookmarkEnd w:id="43"/>
     <w:p>
       <w:pPr>
@@ -14979,7 +14978,7 @@
           <w:szCs w:val="22"/>
           <w:rtl w:val="0"/>
         </w:rPr>
-        <w:t xml:space="preserve">Uberti, J., Jennings, C., &amp; Rescorla, E. (2024). JavaScript Session Establishment Protocol (JSEP) (RFC 9429). </w:t>
+        <w:t xml:space="preserve">Stewart, R. (2007). Stream Control Transmission Protocol (RFC 4960). </w:t>
       </w:r>
       <w:hyperlink r:id="rId33">
         <w:r>
@@ -14988,7 +14987,7 @@
             <w:szCs w:val="22"/>
             <w:rtl w:val="0"/>
           </w:rPr>
-          <w:t xml:space="preserve">https://datatracker.ietf.org/doc/html/rfc9429</w:t>
+          <w:t xml:space="preserve">https://datatracker.ietf.org/doc/html/rfc4960</w:t>
         </w:r>
       </w:hyperlink>
       <w:r>
@@ -14997,7 +14996,7 @@
         </w:rPr>
       </w:r>
     </w:p>
-    <w:bookmarkStart w:colFirst="0" w:colLast="0" w:name="jjc2ee9pyi1w" w:id="44"/>
+    <w:bookmarkStart w:colFirst="0" w:colLast="0" w:name="x501v9ofrj6a" w:id="44"/>
     <w:bookmarkEnd w:id="44"/>
     <w:p>
       <w:pPr>
@@ -15017,7 +15016,7 @@
           <w:szCs w:val="22"/>
           <w:rtl w:val="0"/>
         </w:rPr>
-        <w:t xml:space="preserve">W3C. (2024). RTCPeerConnection Interface (Editors Draft). </w:t>
+        <w:t xml:space="preserve">Uberti, J., Jennings, C., &amp; Rescorla, E. (2024). JavaScript Session Establishment Protocol (JSEP) (RFC 9429). </w:t>
       </w:r>
       <w:hyperlink r:id="rId34">
         <w:r>
@@ -15026,7 +15025,7 @@
             <w:szCs w:val="22"/>
             <w:rtl w:val="0"/>
           </w:rPr>
-          <w:t xml:space="preserve">https://w3c.github.io/webrtc-pc/#rtcpeerconnection-interface</w:t>
+          <w:t xml:space="preserve">https://datatracker.ietf.org/doc/html/rfc9429</w:t>
         </w:r>
       </w:hyperlink>
       <w:r>
@@ -15055,7 +15054,7 @@
           <w:szCs w:val="22"/>
           <w:rtl w:val="0"/>
         </w:rPr>
-        <w:t xml:space="preserve">W3C. (2024). WebRTC: Real-Time Communication in Browsers (Recommendation). </w:t>
+        <w:t xml:space="preserve">W3C. (2025). WebRTC: Real-Time Communication in Browsers (Recommendation). </w:t>
       </w:r>
       <w:hyperlink r:id="rId35">
         <w:r>
@@ -15064,7 +15063,7 @@
             <w:szCs w:val="22"/>
             <w:rtl w:val="0"/>
           </w:rPr>
-          <w:t xml:space="preserve">https://www.w3.org/TR/2024/REC-webrtc-20241008/</w:t>
+          <w:t xml:space="preserve">https://www.w3.org/TR/webrtc/</w:t>
         </w:r>
       </w:hyperlink>
       <w:r>

</xml_diff>

<commit_message>
Update CIET 2026 full paper
- Use no indents and fix line endings
</commit_message>
<xml_diff>
--- a/CIET-2026/Implementation of WebRTC in Real-time Communication Applications.docx
+++ b/CIET-2026/Implementation of WebRTC in Real-time Communication Applications.docx
@@ -436,7 +436,7 @@
     </w:p>
     <w:p>
       <w:pPr>
-        <w:ind w:firstLine="720"/>
+        <w:ind w:left="0" w:firstLine="0"/>
         <w:rPr/>
       </w:pPr>
       <w:r>
@@ -458,8 +458,17 @@
           <w:rtl w:val="0"/>
         </w:rPr>
         <w:t xml:space="preserve">.</w:t>
-        <w:br w:type="textWrapping"/>
-        <w:tab/>
+      </w:r>
+    </w:p>
+    <w:p>
+      <w:pPr>
+        <w:ind w:left="0" w:firstLine="0"/>
+        <w:rPr/>
+      </w:pPr>
+      <w:r>
+        <w:rPr>
+          <w:rtl w:val="0"/>
+        </w:rPr>
         <w:t xml:space="preserve">The WebRTC protocol is essentially composed of a series of standardized protocols and is therefore often described as a collection of protocols because it orchestrates various protocols and mechanisms for establishing, maintaining, and securing real-time communication, as shown in Figure </w:t>
       </w:r>
       <w:hyperlink w:anchor="f48swbl9mdar">
@@ -506,12 +515,12 @@
           <wp:inline distB="114300" distT="114300" distL="114300" distR="114300">
             <wp:extent cx="3686175" cy="2431322"/>
             <wp:effectExtent b="0" l="0" r="0" t="0"/>
-            <wp:docPr id="16" name="image2.png"/>
+            <wp:docPr id="16" name="image3.png"/>
             <a:graphic>
               <a:graphicData uri="http://schemas.openxmlformats.org/drawingml/2006/picture">
                 <pic:pic>
                   <pic:nvPicPr>
-                    <pic:cNvPr id="0" name="image2.png"/>
+                    <pic:cNvPr id="0" name="image3.png"/>
                     <pic:cNvPicPr preferRelativeResize="0"/>
                   </pic:nvPicPr>
                   <pic:blipFill>
@@ -576,7 +585,7 @@
     </w:p>
     <w:p>
       <w:pPr>
-        <w:ind w:firstLine="720"/>
+        <w:ind w:left="0" w:firstLine="0"/>
         <w:rPr/>
       </w:pPr>
       <w:r>
@@ -604,8 +613,17 @@
           <w:rtl w:val="0"/>
         </w:rPr>
         <w:t xml:space="preserve">In addition to Google, companies such as Mozilla, Microsoft, Apple, Intel Corporation, Cisco, and Ericsson participated in the development of specifications and implementation, and support was gradually introduced in all modern web browsers, making WebRTC the standard mechanism for in-browser audio-video communication.</w:t>
-        <w:br w:type="textWrapping"/>
-        <w:tab/>
+      </w:r>
+    </w:p>
+    <w:p>
+      <w:pPr>
+        <w:ind w:left="0" w:firstLine="0"/>
+        <w:rPr/>
+      </w:pPr>
+      <w:r>
+        <w:rPr>
+          <w:rtl w:val="0"/>
+        </w:rPr>
         <w:t xml:space="preserve">Today, it is applied in a wide range of applications, from video conferencing to online games, remote control, IoT (Internet of Things) communication, and other scenarios that require low latency and high transmission quality.</w:t>
       </w:r>
     </w:p>
@@ -632,7 +650,7 @@
     </w:p>
     <w:p>
       <w:pPr>
-        <w:ind w:firstLine="720"/>
+        <w:ind w:left="0" w:firstLine="0"/>
         <w:rPr/>
       </w:pPr>
       <w:r>
@@ -640,17 +658,53 @@
           <w:rtl w:val="0"/>
         </w:rPr>
         <w:t xml:space="preserve">WebRTC topologies can be broadly classified into two categories: peer-to-peer (P2P) topologies and client/server topologies.</w:t>
-        <w:br w:type="textWrapping"/>
-        <w:tab/>
+      </w:r>
+    </w:p>
+    <w:p>
+      <w:pPr>
+        <w:ind w:left="0" w:firstLine="0"/>
+        <w:rPr/>
+      </w:pPr>
+      <w:r>
+        <w:rPr>
+          <w:rtl w:val="0"/>
+        </w:rPr>
         <w:t xml:space="preserve">In the simplest case, two endpoints establish a direct peer-to-peer connection and exchange media streams and data. For group scenarios, multiple different topologies can be used, depending on the number of participants, available bandwidth, and application requirements.</w:t>
-        <w:br w:type="textWrapping"/>
-        <w:tab/>
+      </w:r>
+    </w:p>
+    <w:p>
+      <w:pPr>
+        <w:ind w:left="0" w:firstLine="0"/>
+        <w:rPr/>
+      </w:pPr>
+      <w:r>
+        <w:rPr>
+          <w:rtl w:val="0"/>
+        </w:rPr>
         <w:t xml:space="preserve">A full mesh topology implies that each participant is directly connected to every other participant. Each client must then separately encode and send its video stream to each remote participant, which increases network load and limits the practical number of participants, but offers relatively simple implementation without additional server infrastructure.</w:t>
-        <w:br w:type="textWrapping"/>
-        <w:tab/>
+      </w:r>
+    </w:p>
+    <w:p>
+      <w:pPr>
+        <w:ind w:left="0" w:firstLine="0"/>
+        <w:rPr/>
+      </w:pPr>
+      <w:r>
+        <w:rPr>
+          <w:rtl w:val="0"/>
+        </w:rPr>
         <w:t xml:space="preserve">Alternatively, a hybrid mesh topology reduces the number of direct connections by forwarding data through individual participants.</w:t>
-        <w:br w:type="textWrapping"/>
-        <w:tab/>
+      </w:r>
+    </w:p>
+    <w:p>
+      <w:pPr>
+        <w:ind w:left="0" w:firstLine="0"/>
+        <w:rPr/>
+      </w:pPr>
+      <w:r>
+        <w:rPr>
+          <w:rtl w:val="0"/>
+        </w:rPr>
         <w:t xml:space="preserve">Client/server-type topologies use specialized servers: SFU (Selective Forwarding Unit), which selectively forwards incoming streams to all clients, and MCU (Multipoint Conferencing Unit), which merges multiple input streams into a single composite output stream </w:t>
       </w:r>
       <w:hyperlink w:anchor="l22jq4gzf9bv">
@@ -666,8 +720,17 @@
           <w:rtl w:val="0"/>
         </w:rPr>
         <w:t xml:space="preserve">.</w:t>
-        <w:br w:type="textWrapping"/>
-        <w:tab/>
+      </w:r>
+    </w:p>
+    <w:p>
+      <w:pPr>
+        <w:ind w:left="0" w:firstLine="0"/>
+        <w:rPr/>
+      </w:pPr>
+      <w:r>
+        <w:rPr>
+          <w:rtl w:val="0"/>
+        </w:rPr>
         <w:t xml:space="preserve">Figures</w:t>
       </w:r>
       <w:r>
@@ -717,12 +780,12 @@
           <wp:inline distB="114300" distT="114300" distL="114300" distR="114300">
             <wp:extent cx="2111400" cy="540000"/>
             <wp:effectExtent b="0" l="0" r="0" t="0"/>
-            <wp:docPr id="18" name="image7.png"/>
+            <wp:docPr id="18" name="image2.png"/>
             <a:graphic>
               <a:graphicData uri="http://schemas.openxmlformats.org/drawingml/2006/picture">
                 <pic:pic>
                   <pic:nvPicPr>
-                    <pic:cNvPr id="0" name="image7.png"/>
+                    <pic:cNvPr id="0" name="image2.png"/>
                     <pic:cNvPicPr preferRelativeResize="0"/>
                   </pic:nvPicPr>
                   <pic:blipFill>
@@ -814,12 +877,12 @@
           <wp:inline distB="0" distT="0" distL="114300" distR="114300">
             <wp:extent cx="3038475" cy="908294"/>
             <wp:effectExtent b="0" l="0" r="0" t="0"/>
-            <wp:docPr id="23" name="image9.png"/>
+            <wp:docPr id="23" name="image13.png"/>
             <a:graphic>
               <a:graphicData uri="http://schemas.openxmlformats.org/drawingml/2006/picture">
                 <pic:pic>
                   <pic:nvPicPr>
-                    <pic:cNvPr id="0" name="image9.png"/>
+                    <pic:cNvPr id="0" name="image13.png"/>
                     <pic:cNvPicPr preferRelativeResize="0"/>
                   </pic:nvPicPr>
                   <pic:blipFill>
@@ -855,12 +918,12 @@
           <wp:inline distB="0" distT="0" distL="114300" distR="114300">
             <wp:extent cx="2619375" cy="1229549"/>
             <wp:effectExtent b="0" l="0" r="0" t="0"/>
-            <wp:docPr id="14" name="image5.png"/>
+            <wp:docPr id="14" name="image4.png"/>
             <a:graphic>
               <a:graphicData uri="http://schemas.openxmlformats.org/drawingml/2006/picture">
                 <pic:pic>
                   <pic:nvPicPr>
-                    <pic:cNvPr id="0" name="image5.png"/>
+                    <pic:cNvPr id="0" name="image4.png"/>
                     <pic:cNvPicPr preferRelativeResize="0"/>
                   </pic:nvPicPr>
                   <pic:blipFill>
@@ -962,12 +1025,12 @@
           <wp:inline distB="114300" distT="114300" distL="114300" distR="114300">
             <wp:extent cx="4233600" cy="1080000"/>
             <wp:effectExtent b="0" l="0" r="0" t="0"/>
-            <wp:docPr id="22" name="image3.png"/>
+            <wp:docPr id="22" name="image1.png"/>
             <a:graphic>
               <a:graphicData uri="http://schemas.openxmlformats.org/drawingml/2006/picture">
                 <pic:pic>
                   <pic:nvPicPr>
-                    <pic:cNvPr id="0" name="image3.png"/>
+                    <pic:cNvPr id="0" name="image1.png"/>
                     <pic:cNvPicPr preferRelativeResize="0"/>
                   </pic:nvPicPr>
                   <pic:blipFill>
@@ -1038,12 +1101,12 @@
           <wp:inline distB="114300" distT="114300" distL="114300" distR="114300">
             <wp:extent cx="4915823" cy="1076325"/>
             <wp:effectExtent b="0" l="0" r="0" t="0"/>
-            <wp:docPr id="24" name="image15.png"/>
+            <wp:docPr id="24" name="image14.png"/>
             <a:graphic>
               <a:graphicData uri="http://schemas.openxmlformats.org/drawingml/2006/picture">
                 <pic:pic>
                   <pic:nvPicPr>
-                    <pic:cNvPr id="0" name="image15.png"/>
+                    <pic:cNvPr id="0" name="image14.png"/>
                     <pic:cNvPicPr preferRelativeResize="0"/>
                   </pic:nvPicPr>
                   <pic:blipFill>
@@ -1108,7 +1171,7 @@
     </w:p>
     <w:p>
       <w:pPr>
-        <w:ind w:firstLine="720"/>
+        <w:ind w:left="0" w:firstLine="0"/>
         <w:rPr/>
       </w:pPr>
       <w:r>
@@ -1156,7 +1219,7 @@
     </w:p>
     <w:p>
       <w:pPr>
-        <w:ind w:firstLine="720"/>
+        <w:ind w:left="0" w:firstLine="0"/>
         <w:rPr/>
       </w:pPr>
       <w:r>
@@ -1164,8 +1227,17 @@
           <w:rtl w:val="0"/>
         </w:rPr>
         <w:t xml:space="preserve">The establishment of a WebRTC connection can be conceptually broken down into four sequential steps: signaling, connection setup, connection securing, and the actual communication itself, where each subsequent step begins only after the previous one has been fully and successfully completed. The first phase, signaling, encompasses all steps by which two (or more) participants “find” each other and agree on how they will communicate, before the actual audio-video data transmission begins. </w:t>
-        <w:br w:type="textWrapping"/>
-        <w:tab/>
+      </w:r>
+    </w:p>
+    <w:p>
+      <w:pPr>
+        <w:ind w:left="0" w:firstLine="0"/>
+        <w:rPr/>
+      </w:pPr>
+      <w:r>
+        <w:rPr>
+          <w:rtl w:val="0"/>
+        </w:rPr>
         <w:t xml:space="preserve">Signaling is not standardized in WebRTC itself but occurs out-of-band and is considered part of the application logic — the development team freely chooses protocols and message formats (e.g., REST, WebSocket, etc.). First, participants establish a connection to a common signaling channel and somehow identify the room or conversation they are participating in. Then, through that channel, they exchange SDP (Session Description Protocol) messages </w:t>
       </w:r>
       <w:hyperlink w:anchor="8q3b0w5r9qod">
@@ -1201,10 +1273,7 @@
       <w:pPr>
         <w:ind w:firstLine="0"/>
         <w:jc w:val="center"/>
-        <w:rPr>
-          <w:sz w:val="22"/>
-          <w:szCs w:val="22"/>
-        </w:rPr>
+        <w:rPr/>
       </w:pPr>
       <w:r>
         <w:rPr/>
@@ -1212,12 +1281,12 @@
           <wp:inline distB="114300" distT="114300" distL="114300" distR="114300">
             <wp:extent cx="3398400" cy="2880000"/>
             <wp:effectExtent b="0" l="0" r="0" t="0"/>
-            <wp:docPr id="11" name="image11.png"/>
+            <wp:docPr id="11" name="image7.png"/>
             <a:graphic>
               <a:graphicData uri="http://schemas.openxmlformats.org/drawingml/2006/picture">
                 <pic:pic>
                   <pic:nvPicPr>
-                    <pic:cNvPr id="0" name="image11.png"/>
+                    <pic:cNvPr id="0" name="image7.png"/>
                     <pic:cNvPicPr preferRelativeResize="0"/>
                   </pic:nvPicPr>
                   <pic:blipFill>
@@ -1243,14 +1312,21 @@
       </w:r>
       <w:r>
         <w:rPr>
-          <w:sz w:val="20"/>
-          <w:szCs w:val="20"/>
-          <w:rtl w:val="0"/>
-        </w:rPr>
-        <w:br w:type="textWrapping"/>
-      </w:r>
-      <w:bookmarkStart w:colFirst="0" w:colLast="0" w:name="bvfb8cixho5p" w:id="6"/>
-      <w:bookmarkEnd w:id="6"/>
+          <w:rtl w:val="0"/>
+        </w:rPr>
+      </w:r>
+    </w:p>
+    <w:bookmarkStart w:colFirst="0" w:colLast="0" w:name="bvfb8cixho5p" w:id="6"/>
+    <w:bookmarkEnd w:id="6"/>
+    <w:p>
+      <w:pPr>
+        <w:ind w:firstLine="0"/>
+        <w:jc w:val="center"/>
+        <w:rPr>
+          <w:sz w:val="22"/>
+          <w:szCs w:val="22"/>
+        </w:rPr>
+      </w:pPr>
       <w:r>
         <w:rPr>
           <w:b w:val="1"/>
@@ -1272,7 +1348,7 @@
     </w:p>
     <w:p>
       <w:pPr>
-        <w:ind w:firstLine="720"/>
+        <w:ind w:left="0" w:firstLine="0"/>
         <w:rPr/>
       </w:pPr>
       <w:r>
@@ -1322,8 +1398,17 @@
           <w:rtl w:val="0"/>
         </w:rPr>
         <w:t xml:space="preserve"> infrastructure for so-called NAT traversal, i.e., finding paths through the network configuration.</w:t>
-        <w:br w:type="textWrapping"/>
-        <w:tab/>
+      </w:r>
+    </w:p>
+    <w:p>
+      <w:pPr>
+        <w:ind w:left="0" w:firstLine="0"/>
+        <w:rPr/>
+      </w:pPr>
+      <w:r>
+        <w:rPr>
+          <w:rtl w:val="0"/>
+        </w:rPr>
         <w:t xml:space="preserve">ICE gathers various network “candidates” on each side — so-called ICE candidates — which include local addresses, public addresses obtained via STUN servers, and, if necessary, relay addresses obtained via TURN servers. These candidates are then exchanged via the signaling channel and systematically tested to find a pair of candidates through which bidirectional communication can be established with the lowest possible latency. Testing of candidate pairs (connectivity checks) is shown in Figure </w:t>
       </w:r>
       <w:hyperlink w:anchor="bnb34bieg7xv">
@@ -1345,7 +1430,10 @@
       <w:pPr>
         <w:ind w:firstLine="0"/>
         <w:jc w:val="center"/>
-        <w:rPr/>
+        <w:rPr>
+          <w:sz w:val="20"/>
+          <w:szCs w:val="20"/>
+        </w:rPr>
       </w:pPr>
       <w:r>
         <w:rPr/>
@@ -1353,12 +1441,12 @@
           <wp:inline distB="114300" distT="114300" distL="114300" distR="114300">
             <wp:extent cx="2053350" cy="3240000"/>
             <wp:effectExtent b="0" l="0" r="0" t="0"/>
-            <wp:docPr id="12" name="image13.png"/>
+            <wp:docPr id="12" name="image10.png"/>
             <a:graphic>
               <a:graphicData uri="http://schemas.openxmlformats.org/drawingml/2006/picture">
                 <pic:pic>
                   <pic:nvPicPr>
-                    <pic:cNvPr id="0" name="image13.png"/>
+                    <pic:cNvPr id="0" name="image10.png"/>
                     <pic:cNvPicPr preferRelativeResize="0"/>
                   </pic:nvPicPr>
                   <pic:blipFill>
@@ -1384,14 +1472,18 @@
       </w:r>
       <w:r>
         <w:rPr>
-          <w:sz w:val="20"/>
-          <w:szCs w:val="20"/>
-          <w:rtl w:val="0"/>
-        </w:rPr>
-        <w:br w:type="textWrapping"/>
-      </w:r>
-      <w:bookmarkStart w:colFirst="0" w:colLast="0" w:name="bnb34bieg7xv" w:id="7"/>
-      <w:bookmarkEnd w:id="7"/>
+          <w:rtl w:val="0"/>
+        </w:rPr>
+      </w:r>
+    </w:p>
+    <w:bookmarkStart w:colFirst="0" w:colLast="0" w:name="bnb34bieg7xv" w:id="7"/>
+    <w:bookmarkEnd w:id="7"/>
+    <w:p>
+      <w:pPr>
+        <w:ind w:firstLine="0"/>
+        <w:jc w:val="center"/>
+        <w:rPr/>
+      </w:pPr>
       <w:r>
         <w:rPr>
           <w:b w:val="1"/>
@@ -1418,7 +1510,7 @@
     </w:p>
     <w:p>
       <w:pPr>
-        <w:ind w:left="0" w:firstLine="720"/>
+        <w:ind w:left="0" w:firstLine="0"/>
         <w:rPr/>
       </w:pPr>
       <w:r>
@@ -1488,8 +1580,17 @@
           <w:rtl w:val="0"/>
         </w:rPr>
         <w:t xml:space="preserve">. This makes WebRTC require all media traffic to be encrypted and authenticated, with no possibility of disabling encryption in production implementations, thereby ensuring end-users a high level of communication confidentiality and protection.</w:t>
-        <w:br w:type="textWrapping"/>
-        <w:tab/>
+      </w:r>
+    </w:p>
+    <w:p>
+      <w:pPr>
+        <w:ind w:left="0" w:firstLine="0"/>
+        <w:rPr/>
+      </w:pPr>
+      <w:r>
+        <w:rPr>
+          <w:rtl w:val="0"/>
+        </w:rPr>
         <w:t xml:space="preserve">In the fourth and final phase, actual communication takes place. WebRTC uses two protocols for actual data exchange between participants: RTP </w:t>
       </w:r>
       <w:hyperlink w:anchor="owyroi7qj1u8">
@@ -1544,7 +1645,7 @@
     </w:p>
     <w:p>
       <w:pPr>
-        <w:ind w:firstLine="720"/>
+        <w:ind w:left="0" w:firstLine="0"/>
         <w:rPr/>
       </w:pPr>
       <w:r>
@@ -1572,11 +1673,29 @@
           <w:rtl w:val="0"/>
         </w:rPr>
         <w:t xml:space="preserve">that connects students and tutors, facilitating the organization and management of online and onsite tutoring sessions. The application enables students to easily find and book tutoring sessions, while tutors can efficiently manage their own schedules, offers, and bookings. Participation in online tutoring sessions is supported by integration of peer-to-peer WebRTC technology for video calls. The full-stack web application was developed in the React development framework Next.js, while a relational PostgreSQL database managed via Prisma ORM and hosted on the Supabase platform is used for data storage.</w:t>
-        <w:br w:type="textWrapping"/>
-        <w:tab/>
+      </w:r>
+    </w:p>
+    <w:p>
+      <w:pPr>
+        <w:ind w:left="0" w:firstLine="0"/>
+        <w:rPr/>
+      </w:pPr>
+      <w:r>
+        <w:rPr>
+          <w:rtl w:val="0"/>
+        </w:rPr>
         <w:t xml:space="preserve">Since WebRTC does not specify the signaling method, this application uses the real-time functionalities of the Supabase platform as the signaling channel. This means that the messages needed to establish the connection are exchanged via the Supabase real-time channel, while the media streams themselves (audio and video) are established directly between participants' browsers after agreeing on the parameters. In this way, the data layer (Supabase/PostgreSQL) and the communication layer (WebRTC) are integrated into a whole — Supabase ensures reliable and scalable exchange of signaling messages, while WebRTC handles real-time multimedia transmission.</w:t>
-        <w:br w:type="textWrapping"/>
-        <w:tab/>
+      </w:r>
+    </w:p>
+    <w:p>
+      <w:pPr>
+        <w:ind w:left="0" w:firstLine="0"/>
+        <w:rPr/>
+      </w:pPr>
+      <w:r>
+        <w:rPr>
+          <w:rtl w:val="0"/>
+        </w:rPr>
         <w:t xml:space="preserve">Figure</w:t>
       </w:r>
       <w:r>
@@ -1610,7 +1729,10 @@
       <w:pPr>
         <w:ind w:firstLine="0"/>
         <w:jc w:val="center"/>
-        <w:rPr/>
+        <w:rPr>
+          <w:sz w:val="20"/>
+          <w:szCs w:val="20"/>
+        </w:rPr>
       </w:pPr>
       <w:r>
         <w:rPr/>
@@ -1618,12 +1740,12 @@
           <wp:inline distB="114300" distT="114300" distL="114300" distR="114300">
             <wp:extent cx="5760000" cy="1767600"/>
             <wp:effectExtent b="0" l="0" r="0" t="0"/>
-            <wp:docPr id="15" name="image8.png"/>
+            <wp:docPr id="15" name="image9.png"/>
             <a:graphic>
               <a:graphicData uri="http://schemas.openxmlformats.org/drawingml/2006/picture">
                 <pic:pic>
                   <pic:nvPicPr>
-                    <pic:cNvPr id="0" name="image8.png"/>
+                    <pic:cNvPr id="0" name="image9.png"/>
                     <pic:cNvPicPr preferRelativeResize="0"/>
                   </pic:nvPicPr>
                   <pic:blipFill>
@@ -1649,14 +1771,18 @@
       </w:r>
       <w:r>
         <w:rPr>
-          <w:sz w:val="20"/>
-          <w:szCs w:val="20"/>
-          <w:rtl w:val="0"/>
-        </w:rPr>
-        <w:br w:type="textWrapping"/>
-      </w:r>
-      <w:bookmarkStart w:colFirst="0" w:colLast="0" w:name="di2villfpwvi" w:id="9"/>
-      <w:bookmarkEnd w:id="9"/>
+          <w:rtl w:val="0"/>
+        </w:rPr>
+      </w:r>
+    </w:p>
+    <w:bookmarkStart w:colFirst="0" w:colLast="0" w:name="di2villfpwvi" w:id="9"/>
+    <w:bookmarkEnd w:id="9"/>
+    <w:p>
+      <w:pPr>
+        <w:ind w:firstLine="0"/>
+        <w:jc w:val="center"/>
+        <w:rPr/>
+      </w:pPr>
       <w:r>
         <w:rPr>
           <w:b w:val="1"/>
@@ -1683,7 +1809,7 @@
     </w:p>
     <w:p>
       <w:pPr>
-        <w:ind w:firstLine="720"/>
+        <w:ind w:left="0" w:firstLine="0"/>
         <w:rPr/>
       </w:pPr>
       <w:r>
@@ -1736,8 +1862,17 @@
           <w:rtl w:val="0"/>
         </w:rPr>
         <w:t xml:space="preserve">, support for online tutoring is modeled in the application domain. This way, online and live sessions are clearly distinguished in the business logic and user interface.</w:t>
-        <w:br w:type="textWrapping"/>
-        <w:tab/>
+      </w:r>
+    </w:p>
+    <w:p>
+      <w:pPr>
+        <w:ind w:left="0" w:firstLine="0"/>
+        <w:rPr/>
+      </w:pPr>
+      <w:r>
+        <w:rPr>
+          <w:rtl w:val="0"/>
+        </w:rPr>
         <w:t xml:space="preserve">Online tutoring sessions take place through WebRTC video calls in so-called meeting rooms. Room initialization is implemented in the client-side React component </w:t>
       </w:r>
       <w:r>
@@ -1754,8 +1889,17 @@
           <w:rtl w:val="0"/>
         </w:rPr>
         <w:t xml:space="preserve">, which manages the signaling client, local media streams, and the map of WebRTC connections to other participants.</w:t>
-        <w:br w:type="textWrapping"/>
-        <w:tab/>
+      </w:r>
+    </w:p>
+    <w:p>
+      <w:pPr>
+        <w:ind w:left="0" w:firstLine="0"/>
+        <w:rPr/>
+      </w:pPr>
+      <w:r>
+        <w:rPr>
+          <w:rtl w:val="0"/>
+        </w:rPr>
         <w:t xml:space="preserve">To enable group online tutoring sessions, video calls are implemented in a full mesh topology, where each participant establishes a separate </w:t>
       </w:r>
       <w:r>
@@ -1776,7 +1920,7 @@
     </w:p>
     <w:p>
       <w:pPr>
-        <w:ind w:firstLine="720"/>
+        <w:ind w:left="0" w:firstLine="0"/>
         <w:rPr>
           <w:sz w:val="22"/>
           <w:szCs w:val="22"/>
@@ -1975,7 +2119,7 @@
     </w:p>
     <w:p>
       <w:pPr>
-        <w:ind w:firstLine="720"/>
+        <w:ind w:left="0" w:firstLine="0"/>
         <w:rPr/>
       </w:pPr>
       <w:r>
@@ -2661,10 +2805,16 @@
         <w:rPr>
           <w:rtl w:val="0"/>
         </w:rPr>
-        <w:br w:type="textWrapping"/>
-      </w:r>
-      <w:bookmarkStart w:colFirst="0" w:colLast="0" w:name="bdkl4ceqvm2f" w:id="10"/>
-      <w:bookmarkEnd w:id="10"/>
+      </w:r>
+    </w:p>
+    <w:bookmarkStart w:colFirst="0" w:colLast="0" w:name="bdkl4ceqvm2f" w:id="10"/>
+    <w:bookmarkEnd w:id="10"/>
+    <w:p>
+      <w:pPr>
+        <w:ind w:left="0" w:firstLine="0"/>
+        <w:jc w:val="center"/>
+        <w:rPr/>
+      </w:pPr>
       <w:r>
         <w:rPr>
           <w:b w:val="1"/>
@@ -2691,7 +2841,7 @@
     </w:p>
     <w:p>
       <w:pPr>
-        <w:ind w:firstLine="720"/>
+        <w:ind w:left="0" w:firstLine="0"/>
         <w:rPr/>
       </w:pPr>
       <w:r>
@@ -2750,7 +2900,7 @@
     </w:p>
     <w:p>
       <w:pPr>
-        <w:ind w:firstLine="720"/>
+        <w:ind w:left="0" w:firstLine="0"/>
         <w:rPr/>
       </w:pPr>
       <w:r>
@@ -2786,7 +2936,7 @@
           <mc:Choice Requires="wpg">
             <w:drawing>
               <wp:inline distB="114300" distT="114300" distL="114300" distR="114300">
-                <wp:extent cx="5759140" cy="1676823"/>
+                <wp:extent cx="5759140" cy="1641706"/>
                 <wp:effectExtent b="0" l="0" r="0" t="0"/>
                 <wp:docPr id="8" name=""/>
                 <a:graphic>
@@ -2796,8 +2946,8 @@
                       <wps:cNvPr id="2" name="Shape 2"/>
                       <wps:spPr>
                         <a:xfrm>
-                          <a:off x="140575" y="438375"/>
-                          <a:ext cx="6227100" cy="1798200"/>
+                          <a:off x="140575" y="471925"/>
+                          <a:ext cx="6227100" cy="1764600"/>
                         </a:xfrm>
                         <a:prstGeom prst="rect">
                           <a:avLst/>
@@ -3833,7 +3983,7 @@
           <mc:Fallback>
             <w:drawing>
               <wp:inline distB="114300" distT="114300" distL="114300" distR="114300">
-                <wp:extent cx="5759140" cy="1676823"/>
+                <wp:extent cx="5759140" cy="1641706"/>
                 <wp:effectExtent b="0" l="0" r="0" t="0"/>
                 <wp:docPr id="8" name="image22.png"/>
                 <a:graphic>
@@ -3853,7 +4003,7 @@
                       <pic:spPr>
                         <a:xfrm>
                           <a:off x="0" y="0"/>
-                          <a:ext cx="5759140" cy="1676823"/>
+                          <a:ext cx="5759140" cy="1641706"/>
                         </a:xfrm>
                         <a:prstGeom prst="rect"/>
                         <a:ln/>
@@ -3870,10 +4020,16 @@
         <w:rPr>
           <w:rtl w:val="0"/>
         </w:rPr>
-        <w:br w:type="textWrapping"/>
-      </w:r>
-      <w:bookmarkStart w:colFirst="0" w:colLast="0" w:name="5ya0o68c0rzj" w:id="12"/>
-      <w:bookmarkEnd w:id="12"/>
+      </w:r>
+    </w:p>
+    <w:bookmarkStart w:colFirst="0" w:colLast="0" w:name="5ya0o68c0rzj" w:id="12"/>
+    <w:bookmarkEnd w:id="12"/>
+    <w:p>
+      <w:pPr>
+        <w:ind w:firstLine="0"/>
+        <w:jc w:val="center"/>
+        <w:rPr/>
+      </w:pPr>
       <w:r>
         <w:rPr>
           <w:b w:val="1"/>
@@ -3900,7 +4056,7 @@
     </w:p>
     <w:p>
       <w:pPr>
-        <w:ind w:left="0" w:firstLine="720"/>
+        <w:ind w:left="0" w:firstLine="0"/>
         <w:rPr/>
       </w:pPr>
       <w:r>
@@ -4004,7 +4160,7 @@
     </w:p>
     <w:p>
       <w:pPr>
-        <w:ind w:firstLine="720"/>
+        <w:ind w:left="0" w:firstLine="0"/>
         <w:rPr/>
       </w:pPr>
       <w:r>
@@ -4040,7 +4196,7 @@
           <mc:Choice Requires="wpg">
             <w:drawing>
               <wp:inline distB="114300" distT="114300" distL="114300" distR="114300">
-                <wp:extent cx="5759140" cy="1562693"/>
+                <wp:extent cx="5759140" cy="1510018"/>
                 <wp:effectExtent b="0" l="0" r="0" t="0"/>
                 <wp:docPr id="5" name=""/>
                 <a:graphic>
@@ -4050,8 +4206,8 @@
                       <wps:cNvPr id="2" name="Shape 2"/>
                       <wps:spPr>
                         <a:xfrm>
-                          <a:off x="140575" y="438375"/>
-                          <a:ext cx="6227100" cy="1679100"/>
+                          <a:off x="140575" y="502050"/>
+                          <a:ext cx="6227100" cy="1615500"/>
                         </a:xfrm>
                         <a:prstGeom prst="rect">
                           <a:avLst/>
@@ -4842,7 +4998,7 @@
           <mc:Fallback>
             <w:drawing>
               <wp:inline distB="114300" distT="114300" distL="114300" distR="114300">
-                <wp:extent cx="5759140" cy="1562693"/>
+                <wp:extent cx="5759140" cy="1510018"/>
                 <wp:effectExtent b="0" l="0" r="0" t="0"/>
                 <wp:docPr id="5" name="image19.png"/>
                 <a:graphic>
@@ -4862,7 +5018,7 @@
                       <pic:spPr>
                         <a:xfrm>
                           <a:off x="0" y="0"/>
-                          <a:ext cx="5759140" cy="1562693"/>
+                          <a:ext cx="5759140" cy="1510018"/>
                         </a:xfrm>
                         <a:prstGeom prst="rect"/>
                         <a:ln/>
@@ -4879,10 +5035,16 @@
         <w:rPr>
           <w:rtl w:val="0"/>
         </w:rPr>
-        <w:br w:type="textWrapping"/>
-      </w:r>
-      <w:bookmarkStart w:colFirst="0" w:colLast="0" w:name="q7osjsa1aznh" w:id="14"/>
-      <w:bookmarkEnd w:id="14"/>
+      </w:r>
+    </w:p>
+    <w:bookmarkStart w:colFirst="0" w:colLast="0" w:name="q7osjsa1aznh" w:id="14"/>
+    <w:bookmarkEnd w:id="14"/>
+    <w:p>
+      <w:pPr>
+        <w:ind w:firstLine="0"/>
+        <w:jc w:val="center"/>
+        <w:rPr/>
+      </w:pPr>
       <w:r>
         <w:rPr>
           <w:b w:val="1"/>
@@ -4909,7 +5071,7 @@
     </w:p>
     <w:p>
       <w:pPr>
-        <w:ind w:firstLine="720"/>
+        <w:ind w:left="0" w:firstLine="0"/>
         <w:rPr/>
       </w:pPr>
       <w:r>
@@ -4966,7 +5128,7 @@
     </w:p>
     <w:p>
       <w:pPr>
-        <w:ind w:firstLine="720"/>
+        <w:ind w:left="0" w:firstLine="0"/>
         <w:rPr/>
       </w:pPr>
       <w:r>
@@ -6466,10 +6628,16 @@
         <w:rPr>
           <w:rtl w:val="0"/>
         </w:rPr>
-        <w:br w:type="textWrapping"/>
-      </w:r>
-      <w:bookmarkStart w:colFirst="0" w:colLast="0" w:name="tbr6fxi803mb" w:id="15"/>
-      <w:bookmarkEnd w:id="15"/>
+      </w:r>
+    </w:p>
+    <w:bookmarkStart w:colFirst="0" w:colLast="0" w:name="tbr6fxi803mb" w:id="15"/>
+    <w:bookmarkEnd w:id="15"/>
+    <w:p>
+      <w:pPr>
+        <w:ind w:firstLine="0"/>
+        <w:jc w:val="center"/>
+        <w:rPr/>
+      </w:pPr>
       <w:r>
         <w:rPr>
           <w:b w:val="1"/>
@@ -6496,7 +6664,7 @@
     </w:p>
     <w:p>
       <w:pPr>
-        <w:ind w:left="0" w:firstLine="720"/>
+        <w:ind w:left="0" w:firstLine="0"/>
         <w:rPr/>
       </w:pPr>
       <w:r>
@@ -6570,7 +6738,7 @@
     </w:p>
     <w:p>
       <w:pPr>
-        <w:ind w:left="0" w:firstLine="720"/>
+        <w:ind w:left="0" w:firstLine="0"/>
         <w:rPr/>
       </w:pPr>
       <w:r>
@@ -7821,10 +7989,16 @@
         <w:rPr>
           <w:rtl w:val="0"/>
         </w:rPr>
-        <w:br w:type="textWrapping"/>
-      </w:r>
-      <w:bookmarkStart w:colFirst="0" w:colLast="0" w:name="jpwu86ap8d40" w:id="17"/>
-      <w:bookmarkEnd w:id="17"/>
+      </w:r>
+    </w:p>
+    <w:bookmarkStart w:colFirst="0" w:colLast="0" w:name="jpwu86ap8d40" w:id="17"/>
+    <w:bookmarkEnd w:id="17"/>
+    <w:p>
+      <w:pPr>
+        <w:ind w:firstLine="0"/>
+        <w:jc w:val="center"/>
+        <w:rPr/>
+      </w:pPr>
       <w:r>
         <w:rPr>
           <w:b w:val="1"/>
@@ -7851,7 +8025,7 @@
     </w:p>
     <w:p>
       <w:pPr>
-        <w:ind w:firstLine="720"/>
+        <w:ind w:left="0" w:firstLine="0"/>
         <w:rPr/>
       </w:pPr>
       <w:r>
@@ -7904,7 +8078,7 @@
     </w:p>
     <w:p>
       <w:pPr>
-        <w:ind w:firstLine="720"/>
+        <w:ind w:left="0" w:firstLine="0"/>
         <w:rPr/>
       </w:pPr>
       <w:r>
@@ -8947,10 +9121,16 @@
         <w:rPr>
           <w:rtl w:val="0"/>
         </w:rPr>
-        <w:br w:type="textWrapping"/>
-      </w:r>
-      <w:bookmarkStart w:colFirst="0" w:colLast="0" w:name="pgru5acecaa9" w:id="18"/>
-      <w:bookmarkEnd w:id="18"/>
+      </w:r>
+    </w:p>
+    <w:bookmarkStart w:colFirst="0" w:colLast="0" w:name="pgru5acecaa9" w:id="18"/>
+    <w:bookmarkEnd w:id="18"/>
+    <w:p>
+      <w:pPr>
+        <w:ind w:firstLine="0"/>
+        <w:jc w:val="center"/>
+        <w:rPr/>
+      </w:pPr>
       <w:r>
         <w:rPr>
           <w:b w:val="1"/>
@@ -8977,7 +9157,7 @@
     </w:p>
     <w:p>
       <w:pPr>
-        <w:ind w:left="0" w:firstLine="720"/>
+        <w:ind w:left="0" w:firstLine="0"/>
         <w:rPr/>
       </w:pPr>
       <w:r>
@@ -9006,7 +9186,7 @@
     </w:p>
     <w:p>
       <w:pPr>
-        <w:ind w:left="0" w:firstLine="720"/>
+        <w:ind w:left="0" w:firstLine="0"/>
         <w:rPr/>
       </w:pPr>
       <w:r>
@@ -9747,12 +9927,12 @@
               <wp:inline distB="114300" distT="114300" distL="114300" distR="114300">
                 <wp:extent cx="5759140" cy="1018385"/>
                 <wp:effectExtent b="0" l="0" r="0" t="0"/>
-                <wp:docPr id="1" name="image14.png"/>
+                <wp:docPr id="1" name="image15.png"/>
                 <a:graphic>
                   <a:graphicData uri="http://schemas.openxmlformats.org/drawingml/2006/picture">
                     <pic:pic>
                       <pic:nvPicPr>
-                        <pic:cNvPr id="0" name="image14.png"/>
+                        <pic:cNvPr id="0" name="image15.png"/>
                         <pic:cNvPicPr preferRelativeResize="0"/>
                       </pic:nvPicPr>
                       <pic:blipFill>
@@ -9782,10 +9962,16 @@
         <w:rPr>
           <w:rtl w:val="0"/>
         </w:rPr>
-        <w:br w:type="textWrapping"/>
-      </w:r>
-      <w:bookmarkStart w:colFirst="0" w:colLast="0" w:name="ymub6rgem0ta" w:id="20"/>
-      <w:bookmarkEnd w:id="20"/>
+      </w:r>
+    </w:p>
+    <w:bookmarkStart w:colFirst="0" w:colLast="0" w:name="ymub6rgem0ta" w:id="20"/>
+    <w:bookmarkEnd w:id="20"/>
+    <w:p>
+      <w:pPr>
+        <w:ind w:firstLine="0"/>
+        <w:jc w:val="center"/>
+        <w:rPr/>
+      </w:pPr>
       <w:r>
         <w:rPr>
           <w:b w:val="1"/>
@@ -9812,7 +9998,7 @@
     </w:p>
     <w:p>
       <w:pPr>
-        <w:ind w:left="0" w:firstLine="720"/>
+        <w:ind w:left="0" w:firstLine="0"/>
         <w:rPr/>
       </w:pPr>
       <w:r>
@@ -9871,7 +10057,7 @@
     </w:p>
     <w:p>
       <w:pPr>
-        <w:ind w:left="0" w:firstLine="720"/>
+        <w:ind w:left="0" w:firstLine="0"/>
         <w:rPr/>
       </w:pPr>
       <w:r>
@@ -11595,10 +11781,16 @@
         <w:rPr>
           <w:rtl w:val="0"/>
         </w:rPr>
-        <w:br w:type="textWrapping"/>
-      </w:r>
-      <w:bookmarkStart w:colFirst="0" w:colLast="0" w:name="4ny2n4taxs30" w:id="22"/>
-      <w:bookmarkEnd w:id="22"/>
+      </w:r>
+    </w:p>
+    <w:bookmarkStart w:colFirst="0" w:colLast="0" w:name="4ny2n4taxs30" w:id="22"/>
+    <w:bookmarkEnd w:id="22"/>
+    <w:p>
+      <w:pPr>
+        <w:ind w:firstLine="0"/>
+        <w:jc w:val="center"/>
+        <w:rPr/>
+      </w:pPr>
       <w:r>
         <w:rPr>
           <w:b w:val="1"/>
@@ -11625,7 +11817,7 @@
     </w:p>
     <w:p>
       <w:pPr>
-        <w:ind w:left="0" w:firstLine="720"/>
+        <w:ind w:left="0" w:firstLine="0"/>
         <w:rPr/>
       </w:pPr>
       <w:r>
@@ -11684,7 +11876,7 @@
     </w:p>
     <w:p>
       <w:pPr>
-        <w:ind w:left="0" w:firstLine="720"/>
+        <w:ind w:left="0" w:firstLine="0"/>
         <w:rPr/>
       </w:pPr>
       <w:r>
@@ -12512,10 +12704,16 @@
         <w:rPr>
           <w:rtl w:val="0"/>
         </w:rPr>
-        <w:br w:type="textWrapping"/>
-      </w:r>
-      <w:bookmarkStart w:colFirst="0" w:colLast="0" w:name="rmeb5d6i0dmn" w:id="24"/>
-      <w:bookmarkEnd w:id="24"/>
+      </w:r>
+    </w:p>
+    <w:bookmarkStart w:colFirst="0" w:colLast="0" w:name="rmeb5d6i0dmn" w:id="24"/>
+    <w:bookmarkEnd w:id="24"/>
+    <w:p>
+      <w:pPr>
+        <w:ind w:firstLine="0"/>
+        <w:jc w:val="center"/>
+        <w:rPr/>
+      </w:pPr>
       <w:r>
         <w:rPr>
           <w:b w:val="1"/>
@@ -12542,7 +12740,7 @@
     </w:p>
     <w:p>
       <w:pPr>
-        <w:ind w:left="0" w:firstLine="720"/>
+        <w:ind w:left="0" w:firstLine="0"/>
         <w:rPr/>
       </w:pPr>
       <w:r>
@@ -12601,7 +12799,7 @@
     </w:p>
     <w:p>
       <w:pPr>
-        <w:ind w:left="0" w:firstLine="720"/>
+        <w:ind w:left="0" w:firstLine="0"/>
         <w:rPr/>
       </w:pPr>
       <w:r>
@@ -13882,10 +14080,16 @@
         <w:rPr>
           <w:rtl w:val="0"/>
         </w:rPr>
-        <w:br w:type="textWrapping"/>
-      </w:r>
-      <w:bookmarkStart w:colFirst="0" w:colLast="0" w:name="qo4d9pc7bj7p" w:id="26"/>
-      <w:bookmarkEnd w:id="26"/>
+      </w:r>
+    </w:p>
+    <w:bookmarkStart w:colFirst="0" w:colLast="0" w:name="qo4d9pc7bj7p" w:id="26"/>
+    <w:bookmarkEnd w:id="26"/>
+    <w:p>
+      <w:pPr>
+        <w:ind w:firstLine="0"/>
+        <w:jc w:val="center"/>
+        <w:rPr/>
+      </w:pPr>
       <w:r>
         <w:rPr>
           <w:b w:val="1"/>
@@ -13912,7 +14116,7 @@
     </w:p>
     <w:p>
       <w:pPr>
-        <w:ind w:left="0" w:firstLine="720"/>
+        <w:ind w:left="0" w:firstLine="0"/>
         <w:rPr/>
       </w:pPr>
       <w:r>
@@ -13976,8 +14180,20 @@
           <w:rtl w:val="0"/>
         </w:rPr>
         <w:t xml:space="preserve">User Interface and Meeting Room</w:t>
-        <w:br w:type="textWrapping"/>
-        <w:tab/>
+      </w:r>
+    </w:p>
+    <w:p>
+      <w:pPr>
+        <w:pStyle w:val="Heading2"/>
+        <w:ind w:left="0" w:firstLine="0"/>
+        <w:rPr/>
+      </w:pPr>
+      <w:bookmarkStart w:colFirst="0" w:colLast="0" w:name="_9ew65ie72bmx" w:id="28"/>
+      <w:bookmarkEnd w:id="28"/>
+      <w:r>
+        <w:rPr>
+          <w:rtl w:val="0"/>
+        </w:rPr>
         <w:t xml:space="preserve">Figure </w:t>
       </w:r>
       <w:hyperlink w:anchor="9oeh38m0yi7n">
@@ -14012,12 +14228,12 @@
           <wp:inline distB="0" distT="0" distL="114300" distR="114300">
             <wp:extent cx="2905125" cy="2470687"/>
             <wp:effectExtent b="0" l="0" r="0" t="0"/>
-            <wp:docPr id="21" name="image12.png"/>
+            <wp:docPr id="21" name="image6.png"/>
             <a:graphic>
               <a:graphicData uri="http://schemas.openxmlformats.org/drawingml/2006/picture">
                 <pic:pic>
                   <pic:nvPicPr>
-                    <pic:cNvPr id="0" name="image12.png"/>
+                    <pic:cNvPr id="0" name="image6.png"/>
                     <pic:cNvPicPr preferRelativeResize="0"/>
                   </pic:nvPicPr>
                   <pic:blipFill>
@@ -14053,12 +14269,12 @@
           <wp:inline distB="0" distT="0" distL="114300" distR="114300">
             <wp:extent cx="1647825" cy="2946937"/>
             <wp:effectExtent b="0" l="0" r="0" t="0"/>
-            <wp:docPr id="13" name="image4.jpg"/>
+            <wp:docPr id="13" name="image5.jpg"/>
             <a:graphic>
               <a:graphicData uri="http://schemas.openxmlformats.org/drawingml/2006/picture">
                 <pic:pic>
                   <pic:nvPicPr>
-                    <pic:cNvPr id="0" name="image4.jpg"/>
+                    <pic:cNvPr id="0" name="image5.jpg"/>
                     <pic:cNvPicPr preferRelativeResize="0"/>
                   </pic:nvPicPr>
                   <pic:blipFill>
@@ -14086,10 +14302,21 @@
         <w:rPr>
           <w:rtl w:val="0"/>
         </w:rPr>
-        <w:br w:type="textWrapping"/>
-      </w:r>
-      <w:bookmarkStart w:colFirst="0" w:colLast="0" w:name="9oeh38m0yi7n" w:id="28"/>
-      <w:bookmarkEnd w:id="28"/>
+      </w:r>
+    </w:p>
+    <w:bookmarkStart w:colFirst="0" w:colLast="0" w:name="9oeh38m0yi7n" w:id="29"/>
+    <w:bookmarkEnd w:id="29"/>
+    <w:p>
+      <w:pPr>
+        <w:tabs>
+          <w:tab w:val="center" w:leader="none" w:pos="2552"/>
+          <w:tab w:val="center" w:leader="none" w:pos="6521"/>
+        </w:tabs>
+        <w:spacing w:before="120" w:lineRule="auto"/>
+        <w:ind w:firstLine="0"/>
+        <w:jc w:val="center"/>
+        <w:rPr/>
+      </w:pPr>
       <w:r>
         <w:rPr>
           <w:b w:val="1"/>
@@ -14152,7 +14379,7 @@
     </w:p>
     <w:p>
       <w:pPr>
-        <w:ind w:firstLine="720"/>
+        <w:ind w:left="0" w:firstLine="0"/>
         <w:rPr/>
       </w:pPr>
       <w:r>
@@ -14208,12 +14435,12 @@
           <wp:inline distB="114300" distT="114300" distL="114300" distR="114300">
             <wp:extent cx="5076000" cy="3600000"/>
             <wp:effectExtent b="0" l="0" r="0" t="0"/>
-            <wp:docPr id="17" name="image10.png"/>
+            <wp:docPr id="17" name="image12.png"/>
             <a:graphic>
               <a:graphicData uri="http://schemas.openxmlformats.org/drawingml/2006/picture">
                 <pic:pic>
                   <pic:nvPicPr>
-                    <pic:cNvPr id="0" name="image10.png"/>
+                    <pic:cNvPr id="0" name="image12.png"/>
                     <pic:cNvPicPr preferRelativeResize="0"/>
                   </pic:nvPicPr>
                   <pic:blipFill>
@@ -14243,8 +14470,8 @@
         </w:rPr>
       </w:r>
     </w:p>
-    <w:bookmarkStart w:colFirst="0" w:colLast="0" w:name="vgv04f5oihl1" w:id="29"/>
-    <w:bookmarkEnd w:id="29"/>
+    <w:bookmarkStart w:colFirst="0" w:colLast="0" w:name="vgv04f5oihl1" w:id="30"/>
+    <w:bookmarkEnd w:id="30"/>
     <w:p>
       <w:pPr>
         <w:tabs>
@@ -14307,12 +14534,12 @@
           <wp:inline distB="0" distT="0" distL="114300" distR="114300">
             <wp:extent cx="2238375" cy="4401875"/>
             <wp:effectExtent b="0" l="0" r="0" t="0"/>
-            <wp:docPr id="19" name="image1.jpg"/>
+            <wp:docPr id="19" name="image11.jpg"/>
             <a:graphic>
               <a:graphicData uri="http://schemas.openxmlformats.org/drawingml/2006/picture">
                 <pic:pic>
                   <pic:nvPicPr>
-                    <pic:cNvPr id="0" name="image1.jpg"/>
+                    <pic:cNvPr id="0" name="image11.jpg"/>
                     <pic:cNvPicPr preferRelativeResize="0"/>
                   </pic:nvPicPr>
                   <pic:blipFill>
@@ -14342,12 +14569,12 @@
           <wp:inline distB="0" distT="0" distL="114300" distR="114300">
             <wp:extent cx="2062800" cy="4320000"/>
             <wp:effectExtent b="0" l="0" r="0" t="0"/>
-            <wp:docPr id="20" name="image6.jpg"/>
+            <wp:docPr id="20" name="image8.jpg"/>
             <a:graphic>
               <a:graphicData uri="http://schemas.openxmlformats.org/drawingml/2006/picture">
                 <pic:pic>
                   <pic:nvPicPr>
-                    <pic:cNvPr id="0" name="image6.jpg"/>
+                    <pic:cNvPr id="0" name="image8.jpg"/>
                     <pic:cNvPicPr preferRelativeResize="0"/>
                   </pic:nvPicPr>
                   <pic:blipFill>
@@ -14377,8 +14604,8 @@
         </w:rPr>
       </w:r>
     </w:p>
-    <w:bookmarkStart w:colFirst="0" w:colLast="0" w:name="a9kqmpdrumth" w:id="30"/>
-    <w:bookmarkEnd w:id="30"/>
+    <w:bookmarkStart w:colFirst="0" w:colLast="0" w:name="a9kqmpdrumth" w:id="31"/>
+    <w:bookmarkEnd w:id="31"/>
     <w:p>
       <w:pPr>
         <w:tabs>
@@ -14462,8 +14689,8 @@
           <w:bCs w:val="1"/>
         </w:rPr>
       </w:pPr>
-      <w:bookmarkStart w:colFirst="0" w:colLast="0" w:name="_853ps2qlwr22" w:id="31"/>
-      <w:bookmarkEnd w:id="31"/>
+      <w:bookmarkStart w:colFirst="0" w:colLast="0" w:name="_853ps2qlwr22" w:id="32"/>
+      <w:bookmarkEnd w:id="32"/>
       <w:r>
         <w:rPr>
           <w:rtl w:val="0"/>
@@ -14473,7 +14700,7 @@
     </w:p>
     <w:p>
       <w:pPr>
-        <w:ind w:firstLine="720"/>
+        <w:ind w:left="0" w:firstLine="0"/>
         <w:rPr>
           <w:rFonts w:ascii="Times New Roman" w:cs="Times New Roman" w:eastAsia="Times New Roman" w:hAnsi="Times New Roman"/>
           <w:b w:val="0"/>
@@ -14539,8 +14766,8 @@
         </w:rPr>
       </w:r>
     </w:p>
-    <w:bookmarkStart w:colFirst="0" w:colLast="0" w:name="ykr0rz9bhpss" w:id="32"/>
-    <w:bookmarkEnd w:id="32"/>
+    <w:bookmarkStart w:colFirst="0" w:colLast="0" w:name="ykr0rz9bhpss" w:id="33"/>
+    <w:bookmarkEnd w:id="33"/>
     <w:p>
       <w:pPr>
         <w:numPr>
@@ -14577,8 +14804,8 @@
         </w:rPr>
       </w:r>
     </w:p>
-    <w:bookmarkStart w:colFirst="0" w:colLast="0" w:name="jwv7qos6hnl0" w:id="33"/>
-    <w:bookmarkEnd w:id="33"/>
+    <w:bookmarkStart w:colFirst="0" w:colLast="0" w:name="jwv7qos6hnl0" w:id="34"/>
+    <w:bookmarkEnd w:id="34"/>
     <w:p>
       <w:pPr>
         <w:numPr>
@@ -14615,8 +14842,8 @@
         </w:rPr>
       </w:r>
     </w:p>
-    <w:bookmarkStart w:colFirst="0" w:colLast="0" w:name="yjc6wp1gzevb" w:id="34"/>
-    <w:bookmarkEnd w:id="34"/>
+    <w:bookmarkStart w:colFirst="0" w:colLast="0" w:name="yjc6wp1gzevb" w:id="35"/>
+    <w:bookmarkEnd w:id="35"/>
     <w:p>
       <w:pPr>
         <w:numPr>
@@ -14653,8 +14880,8 @@
         </w:rPr>
       </w:r>
     </w:p>
-    <w:bookmarkStart w:colFirst="0" w:colLast="0" w:name="8q3b0w5r9qod" w:id="35"/>
-    <w:bookmarkEnd w:id="35"/>
+    <w:bookmarkStart w:colFirst="0" w:colLast="0" w:name="8q3b0w5r9qod" w:id="36"/>
+    <w:bookmarkEnd w:id="36"/>
     <w:p>
       <w:pPr>
         <w:numPr>
@@ -14691,8 +14918,8 @@
         </w:rPr>
       </w:r>
     </w:p>
-    <w:bookmarkStart w:colFirst="0" w:colLast="0" w:name="81p4pf3ajnnn" w:id="36"/>
-    <w:bookmarkEnd w:id="36"/>
+    <w:bookmarkStart w:colFirst="0" w:colLast="0" w:name="81p4pf3ajnnn" w:id="37"/>
+    <w:bookmarkEnd w:id="37"/>
     <w:p>
       <w:pPr>
         <w:numPr>
@@ -14729,8 +14956,8 @@
         </w:rPr>
       </w:r>
     </w:p>
-    <w:bookmarkStart w:colFirst="0" w:colLast="0" w:name="edet4881e1gr" w:id="37"/>
-    <w:bookmarkEnd w:id="37"/>
+    <w:bookmarkStart w:colFirst="0" w:colLast="0" w:name="edet4881e1gr" w:id="38"/>
+    <w:bookmarkEnd w:id="38"/>
     <w:p>
       <w:pPr>
         <w:numPr>
@@ -14768,8 +14995,8 @@
         </w:rPr>
       </w:r>
     </w:p>
-    <w:bookmarkStart w:colFirst="0" w:colLast="0" w:name="771efax98nz4" w:id="38"/>
-    <w:bookmarkEnd w:id="38"/>
+    <w:bookmarkStart w:colFirst="0" w:colLast="0" w:name="771efax98nz4" w:id="39"/>
+    <w:bookmarkEnd w:id="39"/>
     <w:p>
       <w:pPr>
         <w:numPr>
@@ -14806,8 +15033,8 @@
         </w:rPr>
       </w:r>
     </w:p>
-    <w:bookmarkStart w:colFirst="0" w:colLast="0" w:name="3elz847hzigg" w:id="39"/>
-    <w:bookmarkEnd w:id="39"/>
+    <w:bookmarkStart w:colFirst="0" w:colLast="0" w:name="3elz847hzigg" w:id="40"/>
+    <w:bookmarkEnd w:id="40"/>
     <w:p>
       <w:pPr>
         <w:numPr>
@@ -14844,8 +15071,8 @@
         </w:rPr>
       </w:r>
     </w:p>
-    <w:bookmarkStart w:colFirst="0" w:colLast="0" w:name="u10sn56o268o" w:id="40"/>
-    <w:bookmarkEnd w:id="40"/>
+    <w:bookmarkStart w:colFirst="0" w:colLast="0" w:name="u10sn56o268o" w:id="41"/>
+    <w:bookmarkEnd w:id="41"/>
     <w:p>
       <w:pPr>
         <w:numPr>
@@ -14882,8 +15109,8 @@
         </w:rPr>
       </w:r>
     </w:p>
-    <w:bookmarkStart w:colFirst="0" w:colLast="0" w:name="tboo8a6eh01h" w:id="41"/>
-    <w:bookmarkEnd w:id="41"/>
+    <w:bookmarkStart w:colFirst="0" w:colLast="0" w:name="tboo8a6eh01h" w:id="42"/>
+    <w:bookmarkEnd w:id="42"/>
     <w:p>
       <w:pPr>
         <w:numPr>
@@ -14920,8 +15147,8 @@
         </w:rPr>
       </w:r>
     </w:p>
-    <w:bookmarkStart w:colFirst="0" w:colLast="0" w:name="owyroi7qj1u8" w:id="42"/>
-    <w:bookmarkEnd w:id="42"/>
+    <w:bookmarkStart w:colFirst="0" w:colLast="0" w:name="owyroi7qj1u8" w:id="43"/>
+    <w:bookmarkEnd w:id="43"/>
     <w:p>
       <w:pPr>
         <w:numPr>
@@ -14958,8 +15185,8 @@
         </w:rPr>
       </w:r>
     </w:p>
-    <w:bookmarkStart w:colFirst="0" w:colLast="0" w:name="pubx4x9yx3oz" w:id="43"/>
-    <w:bookmarkEnd w:id="43"/>
+    <w:bookmarkStart w:colFirst="0" w:colLast="0" w:name="pubx4x9yx3oz" w:id="44"/>
+    <w:bookmarkEnd w:id="44"/>
     <w:p>
       <w:pPr>
         <w:numPr>
@@ -14996,8 +15223,8 @@
         </w:rPr>
       </w:r>
     </w:p>
-    <w:bookmarkStart w:colFirst="0" w:colLast="0" w:name="x501v9ofrj6a" w:id="44"/>
-    <w:bookmarkEnd w:id="44"/>
+    <w:bookmarkStart w:colFirst="0" w:colLast="0" w:name="x501v9ofrj6a" w:id="45"/>
+    <w:bookmarkEnd w:id="45"/>
     <w:p>
       <w:pPr>
         <w:numPr>
@@ -15034,8 +15261,8 @@
         </w:rPr>
       </w:r>
     </w:p>
-    <w:bookmarkStart w:colFirst="0" w:colLast="0" w:name="436lt588xhm" w:id="45"/>
-    <w:bookmarkEnd w:id="45"/>
+    <w:bookmarkStart w:colFirst="0" w:colLast="0" w:name="436lt588xhm" w:id="46"/>
+    <w:bookmarkEnd w:id="46"/>
     <w:p>
       <w:pPr>
         <w:numPr>
@@ -15072,8 +15299,8 @@
         </w:rPr>
       </w:r>
     </w:p>
-    <w:bookmarkStart w:colFirst="0" w:colLast="0" w:name="l22jq4gzf9bv" w:id="46"/>
-    <w:bookmarkEnd w:id="46"/>
+    <w:bookmarkStart w:colFirst="0" w:colLast="0" w:name="l22jq4gzf9bv" w:id="47"/>
+    <w:bookmarkEnd w:id="47"/>
     <w:p>
       <w:pPr>
         <w:numPr>

</xml_diff>

<commit_message>
Add final CIET 2026 paper
- After reviewer's comment
</commit_message>
<xml_diff>
--- a/CIET-2026/Implementation of WebRTC in Real-time Communication Applications.docx
+++ b/CIET-2026/Implementation of WebRTC in Real-time Communication Applications.docx
@@ -90,7 +90,7 @@
           <w:szCs w:val="22"/>
           <w:rtl w:val="0"/>
         </w:rPr>
-        <w:t xml:space="preserve">University of Split, University Department of Professional Studies, Split, Croatia</w:t>
+        <w:t xml:space="preserve">University Department of Professional Studies, University of Split, Split, Croatia</w:t>
       </w:r>
     </w:p>
     <w:p>
@@ -99,6 +99,8 @@
         <w:ind w:firstLine="0"/>
         <w:jc w:val="center"/>
         <w:rPr>
+          <w:i w:val="1"/>
+          <w:iCs w:val="1"/>
           <w:sz w:val="22"/>
           <w:szCs w:val="22"/>
         </w:rPr>
@@ -110,6 +112,11 @@
           <w:rtl w:val="0"/>
         </w:rPr>
         <w:t xml:space="preserve">anamarija.papic@oss.unist.hr</w:t>
+      </w:r>
+      <w:r>
+        <w:rPr>
+          <w:rtl w:val="0"/>
+        </w:rPr>
       </w:r>
     </w:p>
     <w:p>
@@ -151,7 +158,7 @@
           <w:szCs w:val="22"/>
           <w:rtl w:val="0"/>
         </w:rPr>
-        <w:t xml:space="preserve">University of Split, University Department of Professional Studies, Split, Croatia</w:t>
+        <w:t xml:space="preserve">University Department of Professional Studies, University of Split, Split, Croatia</w:t>
       </w:r>
     </w:p>
     <w:p>
@@ -160,6 +167,8 @@
         <w:ind w:firstLine="0"/>
         <w:jc w:val="center"/>
         <w:rPr>
+          <w:i w:val="1"/>
+          <w:iCs w:val="1"/>
           <w:sz w:val="22"/>
           <w:szCs w:val="22"/>
         </w:rPr>
@@ -171,6 +180,11 @@
           <w:rtl w:val="0"/>
         </w:rPr>
         <w:t xml:space="preserve">tea.basic@oss.unist.hr</w:t>
+      </w:r>
+      <w:r>
+        <w:rPr>
+          <w:rtl w:val="0"/>
+        </w:rPr>
       </w:r>
     </w:p>
     <w:p>
@@ -212,7 +226,7 @@
           <w:szCs w:val="22"/>
           <w:rtl w:val="0"/>
         </w:rPr>
-        <w:t xml:space="preserve">University of Split, University Department of Professional Studies, Split, Croatia</w:t>
+        <w:t xml:space="preserve">University Department of Professional Studies, University of Split, Split, Croatia</w:t>
       </w:r>
     </w:p>
     <w:p>
@@ -221,6 +235,8 @@
         <w:ind w:firstLine="0"/>
         <w:jc w:val="center"/>
         <w:rPr>
+          <w:i w:val="1"/>
+          <w:iCs w:val="1"/>
           <w:sz w:val="22"/>
           <w:szCs w:val="22"/>
         </w:rPr>
@@ -232,6 +248,11 @@
           <w:rtl w:val="0"/>
         </w:rPr>
         <w:t xml:space="preserve">nikola.grgic@oss.unist.hr</w:t>
+      </w:r>
+      <w:r>
+        <w:rPr>
+          <w:rtl w:val="0"/>
+        </w:rPr>
       </w:r>
     </w:p>
     <w:p>
@@ -329,7 +350,7 @@
           <w:szCs w:val="22"/>
           <w:rtl w:val="0"/>
         </w:rPr>
-        <w:t xml:space="preserve">This paper describes WebRTC (Web Real-time Communication) as a collection of standardized open-source technologies that enable direct peer-to-peer real-time communication over the internet, both through modern web browsers and native clients in the case of mobile applications. End users can exchange audio, video, and data without the need for additional plugins or dedicated software. WebRTC consists of the WebRTC protocol and the WebRTC API specified for JavaScript, while a library providing the same functionality is available for native clients. Software engineers can integrate WebRTC into modern application architectures in order to deliver robust, low-latency solutions with built-in security, since encryption is mandatory. WebRTC can be roughly broken down into four sequential steps: signaling, connection establishment, securing the connection, and the actual communication, where each subsequent step only begins once the previous one has been completed successfully. In the first phase, signaling, an out-of-band channel (e.g. REST or WebSocket) is used by peers for exchanging SDP messages containing information about media streams, codecs, and network parameters, and to negotiate session parameters. The next step is connecting, where ICE and NAT/firewall traversal mechanisms, together with STUN/TURN infrastructure, are used to discover a viable network path between participants. Once the connection has been established, the transport layer is secured using DTLS and SRTP, which provide encryption and integrity for media and data streams. Finally, the actual communication takes place over RTP for audio and video and SCTP for data channels, with these protocols allowing the application to tune latency, packet loss handling, and reliability according to its requirements. These steps will be described in detail in the paper. The paper will also introduce various parts of the WebRTC API, including interfaces for working with media devices and for establishing peer-to-peer connectivity between clients, with emphasis on the most important interfaces, dictionaries, and types used to set up, open, and manage WebRTC connections. Finally, the focus will be on a practical integration example, presenting the design and implementation of a custom WebRTC-based solution for in-browser audio and video communication between multiple participants, using a modern web application that demonstrates the application of the described concepts and the use of the WebRTC API.</w:t>
+        <w:t xml:space="preserve">This paper describes WebRTC (Web Real-time Communication) as a collection of standardized open-source technologies that enable direct peer-to-peer real-time communication over the internet, across modern web browsers and native mobile applications. End users can exchange audio, video, and data without additional plugins or dedicated software. WebRTC consists of the WebRTC protocol and the WebRTC API (Application Programming Interface) specified for JavaScript, while a library providing the same functionality is available for native clients. Software engineers can integrate WebRTC into modern application architectures to deliver robust, low-latency solutions with built-in security, since encryption is mandatory. WebRTC can be roughly broken down into four sequential steps: signaling, connection establishment, securing the connection, and the actual communication, where each subsequent step only begins once the previous one has been completed successfully. In the first phase, signaling, an out-of-band channel, such as REST (Representational State Transfer) or WebSockets, is used by peers for exchanging SDP (Session Description Protocol) messages containing information about media streams, codecs, and network parameters, and to negotiate session parameters. The next step is connecting, where ICE (Interactive Connectivity Establishment) and NAT (Network Address Translation) / firewall traversal mechanisms, together with STUN (Session Traversal Utilities for NAT) / TURN (Traversal Using Relays around NAT) infrastructure, are used to discover a viable network path between participants. Once the connection has been established, the transport layer is secured using DTLS (Datagram Transport Layer Security) and SRTP (Secure Real-time Transport Protocol), which provide encryption and integrity for media and data streams. Finally, the actual communication takes place over RTP (Real-time Transport Protocol) for audio and video and SCTP (Stream Control Transmission Protocol) for data channels, with these protocols allowing the application to tune latency, packet loss handling, and reliability according to its requirements. These steps will be described in detail in the paper. The paper will also introduce various parts of the WebRTC API, including interfaces for working with media devices and for establishing peer-to-peer connectivity between clients, with emphasis on the most important interfaces, dictionaries, and types used to set up, open, and manage WebRTC connections. Finally, the focus will be on a practical integration example, presenting the design and implementation of a custom WebRTC-based solution for in-browser audio and video communication between multiple participants, using a modern web application that demonstrates the application of the described concepts and the use of the WebRTC API.</w:t>
       </w:r>
       <w:r>
         <w:rPr>
@@ -469,7 +490,7 @@
         <w:rPr>
           <w:rtl w:val="0"/>
         </w:rPr>
-        <w:t xml:space="preserve">The WebRTC protocol is essentially composed of a series of standardized protocols and is therefore often described as a collection of protocols because it orchestrates various protocols and mechanisms for establishing, maintaining, and securing real-time communication, as shown in Figure </w:t>
+        <w:t xml:space="preserve">WebRTC orchestrates various protocols and mechanisms for establishing, maintaining, and securing real-time communication, as shown in Figure </w:t>
       </w:r>
       <w:hyperlink w:anchor="f48swbl9mdar">
         <w:r>
@@ -485,7 +506,7 @@
         </w:rPr>
         <w:t xml:space="preserve"> </w:t>
       </w:r>
-      <w:hyperlink w:anchor="ykr0rz9bhpss">
+      <w:hyperlink w:anchor="9h0vy7btjpko">
         <w:r>
           <w:rPr>
             <w:rtl w:val="0"/>
@@ -515,12 +536,12 @@
           <wp:inline distB="114300" distT="114300" distL="114300" distR="114300">
             <wp:extent cx="3686175" cy="2431322"/>
             <wp:effectExtent b="0" l="0" r="0" t="0"/>
-            <wp:docPr id="16" name="image3.png"/>
+            <wp:docPr id="16" name="image7.png"/>
             <a:graphic>
               <a:graphicData uri="http://schemas.openxmlformats.org/drawingml/2006/picture">
                 <pic:pic>
                   <pic:nvPicPr>
-                    <pic:cNvPr id="0" name="image3.png"/>
+                    <pic:cNvPr id="0" name="image7.png"/>
                     <pic:cNvPicPr preferRelativeResize="0"/>
                   </pic:nvPicPr>
                   <pic:blipFill>
@@ -594,12 +615,12 @@
         </w:rPr>
         <w:t xml:space="preserve">It emerged as an attempt to integrate real-time speech and video technologies, which were previously closed and proprietary, directly into web browsers as an open standard. Google acquired the company Global IP Solutions (GIPS) in 2010 and released the code for their RTC components under the open BSD license, which was a key step in the development of WebRTC. Subsequently, Google launched the WebRTC project in 2011, and standardization took several years, requiring significant efforts and collaboration between two standardization bodies: W3C (World Wide Web Consortium) and IETF (Internet Engineering Task Force), as well as a large number of companies and individuals from the industry </w:t>
       </w:r>
-      <w:hyperlink w:anchor="436lt588xhm">
+      <w:hyperlink w:anchor="19tmmbrp53k4">
         <w:r>
           <w:rPr>
             <w:rtl w:val="0"/>
           </w:rPr>
-          <w:t xml:space="preserve">[14]</w:t>
+          <w:t xml:space="preserve">[2]</w:t>
         </w:r>
       </w:hyperlink>
       <w:r>
@@ -707,12 +728,12 @@
         </w:rPr>
         <w:t xml:space="preserve">Client/server-type topologies use specialized servers: SFU (Selective Forwarding Unit), which selectively forwards incoming streams to all clients, and MCU (Multipoint Conferencing Unit), which merges multiple input streams into a single composite output stream </w:t>
       </w:r>
-      <w:hyperlink w:anchor="l22jq4gzf9bv">
+      <w:hyperlink w:anchor="b5pncglaaxk">
         <w:r>
           <w:rPr>
             <w:rtl w:val="0"/>
           </w:rPr>
-          <w:t xml:space="preserve">[15]</w:t>
+          <w:t xml:space="preserve">[3]</w:t>
         </w:r>
       </w:hyperlink>
       <w:r>
@@ -780,12 +801,12 @@
           <wp:inline distB="114300" distT="114300" distL="114300" distR="114300">
             <wp:extent cx="2111400" cy="540000"/>
             <wp:effectExtent b="0" l="0" r="0" t="0"/>
-            <wp:docPr id="18" name="image2.png"/>
+            <wp:docPr id="18" name="image1.png"/>
             <a:graphic>
               <a:graphicData uri="http://schemas.openxmlformats.org/drawingml/2006/picture">
                 <pic:pic>
                   <pic:nvPicPr>
-                    <pic:cNvPr id="0" name="image2.png"/>
+                    <pic:cNvPr id="0" name="image1.png"/>
                     <pic:cNvPicPr preferRelativeResize="0"/>
                   </pic:nvPicPr>
                   <pic:blipFill>
@@ -877,12 +898,12 @@
           <wp:inline distB="0" distT="0" distL="114300" distR="114300">
             <wp:extent cx="3038475" cy="908294"/>
             <wp:effectExtent b="0" l="0" r="0" t="0"/>
-            <wp:docPr id="23" name="image13.png"/>
+            <wp:docPr id="23" name="image4.png"/>
             <a:graphic>
               <a:graphicData uri="http://schemas.openxmlformats.org/drawingml/2006/picture">
                 <pic:pic>
                   <pic:nvPicPr>
-                    <pic:cNvPr id="0" name="image13.png"/>
+                    <pic:cNvPr id="0" name="image4.png"/>
                     <pic:cNvPicPr preferRelativeResize="0"/>
                   </pic:nvPicPr>
                   <pic:blipFill>
@@ -918,12 +939,12 @@
           <wp:inline distB="0" distT="0" distL="114300" distR="114300">
             <wp:extent cx="2619375" cy="1229549"/>
             <wp:effectExtent b="0" l="0" r="0" t="0"/>
-            <wp:docPr id="14" name="image4.png"/>
+            <wp:docPr id="14" name="image9.png"/>
             <a:graphic>
               <a:graphicData uri="http://schemas.openxmlformats.org/drawingml/2006/picture">
                 <pic:pic>
                   <pic:nvPicPr>
-                    <pic:cNvPr id="0" name="image4.png"/>
+                    <pic:cNvPr id="0" name="image9.png"/>
                     <pic:cNvPicPr preferRelativeResize="0"/>
                   </pic:nvPicPr>
                   <pic:blipFill>
@@ -1025,12 +1046,12 @@
           <wp:inline distB="114300" distT="114300" distL="114300" distR="114300">
             <wp:extent cx="4233600" cy="1080000"/>
             <wp:effectExtent b="0" l="0" r="0" t="0"/>
-            <wp:docPr id="22" name="image1.png"/>
+            <wp:docPr id="22" name="image13.png"/>
             <a:graphic>
               <a:graphicData uri="http://schemas.openxmlformats.org/drawingml/2006/picture">
                 <pic:pic>
                   <pic:nvPicPr>
-                    <pic:cNvPr id="0" name="image1.png"/>
+                    <pic:cNvPr id="0" name="image13.png"/>
                     <pic:cNvPicPr preferRelativeResize="0"/>
                   </pic:nvPicPr>
                   <pic:blipFill>
@@ -1171,6 +1192,23 @@
     </w:p>
     <w:p>
       <w:pPr>
+        <w:pStyle w:val="Heading2"/>
+        <w:numPr>
+          <w:ilvl w:val="1"/>
+          <w:numId w:val="2"/>
+        </w:numPr>
+      </w:pPr>
+      <w:bookmarkStart w:colFirst="0" w:colLast="0" w:name="_1b4c9pbnte7" w:id="5"/>
+      <w:bookmarkEnd w:id="5"/>
+      <w:r>
+        <w:rPr>
+          <w:rtl w:val="0"/>
+        </w:rPr>
+        <w:t xml:space="preserve">Scalability and Constraints of Full Mesh Topology</w:t>
+      </w:r>
+    </w:p>
+    <w:p>
+      <w:pPr>
         <w:ind w:left="0" w:firstLine="0"/>
         <w:rPr/>
       </w:pPr>
@@ -1178,7 +1216,7 @@
         <w:rPr>
           <w:rtl w:val="0"/>
         </w:rPr>
-        <w:t xml:space="preserve">The application described in this paper uses a full mesh topology, meaning that each client in the room establishes one </w:t>
+        <w:t xml:space="preserve">The application described in this paper implements a full mesh topology, meaning that each participant in a full mesh session establishes a direct, bidirectional </w:t>
       </w:r>
       <w:r>
         <w:rPr>
@@ -1193,7 +1231,287 @@
         <w:rPr>
           <w:rtl w:val="0"/>
         </w:rPr>
-        <w:t xml:space="preserve"> link to every other participant.</w:t>
+        <w:t xml:space="preserve"> link to every other participant. This subsection evaluates the theoretical complexity and practical limitations of implementing the full mesh architecture.</w:t>
+      </w:r>
+    </w:p>
+    <w:p>
+      <w:pPr>
+        <w:ind w:left="0" w:firstLine="0"/>
+        <w:rPr/>
+      </w:pPr>
+      <w:r>
+        <w:rPr>
+          <w:rtl w:val="0"/>
+        </w:rPr>
+        <w:t xml:space="preserve">When choosing a topology, the decision to implement full mesh architecture can eliminate the need for a centralized media server, such as an SFU or MCU, thereby reducing initial infrastructure costs and avoiding a single point of failure in the media path.</w:t>
+      </w:r>
+    </w:p>
+    <w:p>
+      <w:pPr>
+        <w:ind w:left="0" w:firstLine="0"/>
+        <w:rPr/>
+      </w:pPr>
+      <w:r>
+        <w:rPr>
+          <w:rtl w:val="0"/>
+        </w:rPr>
+        <w:t xml:space="preserve">However, the main limitation of full mesh topology is its poor scalability. In a complete network, the number of unique bidirectional connections among </w:t>
+      </w:r>
+      <m:oMath>
+        <m:r>
+          <w:rPr/>
+          <m:t xml:space="preserve">N</m:t>
+        </m:r>
+      </m:oMath>
+      <w:r>
+        <w:rPr>
+          <w:rtl w:val="0"/>
+        </w:rPr>
+        <w:t xml:space="preserve"> participants is given by:</w:t>
+      </w:r>
+    </w:p>
+    <w:p>
+      <w:pPr>
+        <w:ind w:left="0" w:firstLine="0"/>
+        <w:rPr/>
+      </w:pPr>
+      <m:oMath>
+        <m:r>
+          <w:rPr/>
+          <m:t xml:space="preserve">C = </m:t>
+        </m:r>
+        <m:f>
+          <m:fPr>
+            <m:ctrlPr>
+              <w:rPr/>
+            </m:ctrlPr>
+          </m:fPr>
+          <m:num>
+            <m:r>
+              <w:rPr/>
+              <m:t xml:space="preserve">N</m:t>
+            </m:r>
+            <m:d>
+              <m:dPr>
+                <m:begChr m:val="("/>
+                <m:endChr m:val=")"/>
+                <m:ctrlPr>
+                  <w:rPr/>
+                </m:ctrlPr>
+              </m:dPr>
+              <m:e>
+                <m:r>
+                  <w:rPr/>
+                  <m:t xml:space="preserve">N - 1</m:t>
+                </m:r>
+              </m:e>
+            </m:d>
+          </m:num>
+          <m:den>
+            <m:r>
+              <w:rPr/>
+              <m:t xml:space="preserve">2</m:t>
+            </m:r>
+          </m:den>
+        </m:f>
+      </m:oMath>
+      <w:r>
+        <w:rPr>
+          <w:rtl w:val="0"/>
+        </w:rPr>
+        <w:tab/>
+        <w:t xml:space="preserve">(1)</w:t>
+      </w:r>
+    </w:p>
+    <w:p>
+      <w:pPr>
+        <w:ind w:left="0" w:firstLine="0"/>
+        <w:rPr/>
+      </w:pPr>
+      <w:r>
+        <w:rPr>
+          <w:rtl w:val="0"/>
+        </w:rPr>
+        <w:t xml:space="preserve">This means that the total number of connections grows quadratically, with </w:t>
+      </w:r>
+      <m:oMath>
+        <m:r>
+          <w:rPr/>
+          <m:t xml:space="preserve">O(</m:t>
+        </m:r>
+        <m:sSup>
+          <m:sSupPr>
+            <m:ctrlPr>
+              <w:rPr/>
+            </m:ctrlPr>
+          </m:sSupPr>
+          <m:e>
+            <m:r>
+              <w:rPr/>
+              <m:t xml:space="preserve">N</m:t>
+            </m:r>
+          </m:e>
+          <m:sup>
+            <m:r>
+              <w:rPr/>
+              <m:t xml:space="preserve">2</m:t>
+            </m:r>
+          </m:sup>
+        </m:sSup>
+        <m:r>
+          <w:rPr/>
+          <m:t xml:space="preserve">)</m:t>
+        </m:r>
+      </m:oMath>
+      <w:r>
+        <w:rPr>
+          <w:rtl w:val="0"/>
+        </w:rPr>
+        <w:t xml:space="preserve"> complexity, as the number of participants increases. From the perspective of an individual client, each participant must maintain connections with the other </w:t>
+      </w:r>
+      <m:oMath>
+        <m:r>
+          <w:rPr/>
+          <m:t xml:space="preserve">N - 1</m:t>
+        </m:r>
+      </m:oMath>
+      <w:r>
+        <w:rPr>
+          <w:rtl w:val="0"/>
+        </w:rPr>
+        <w:t xml:space="preserve"> participants, so the outbound media load per client also grows linearly.</w:t>
+      </w:r>
+    </w:p>
+    <w:p>
+      <w:pPr>
+        <w:ind w:left="0" w:firstLine="0"/>
+        <w:rPr/>
+      </w:pPr>
+      <w:r>
+        <w:rPr>
+          <w:rtl w:val="0"/>
+        </w:rPr>
+        <w:t xml:space="preserve">If one audio/video stream requires an average bandwidth of </w:t>
+      </w:r>
+      <m:oMath>
+        <m:r>
+          <w:rPr/>
+          <m:t xml:space="preserve">B</m:t>
+        </m:r>
+      </m:oMath>
+      <w:r>
+        <w:rPr>
+          <w:rtl w:val="0"/>
+        </w:rPr>
+        <w:t xml:space="preserve">, then the total outbound bandwidth consumed by a single client can be approximated as:</w:t>
+      </w:r>
+    </w:p>
+    <w:p>
+      <w:pPr>
+        <w:ind w:firstLine="0"/>
+        <w:rPr/>
+      </w:pPr>
+      <m:oMath>
+        <m:sSub>
+          <m:sSubPr>
+            <m:ctrlPr>
+              <w:rPr/>
+            </m:ctrlPr>
+          </m:sSubPr>
+          <m:e>
+            <m:r>
+              <w:rPr/>
+              <m:t xml:space="preserve">BW</m:t>
+            </m:r>
+          </m:e>
+          <m:sub>
+            <m:r>
+              <w:rPr/>
+              <m:t xml:space="preserve">out</m:t>
+            </m:r>
+          </m:sub>
+        </m:sSub>
+        <m:r>
+          <w:rPr/>
+          <m:t xml:space="preserve">= </m:t>
+        </m:r>
+        <m:d>
+          <m:dPr>
+            <m:begChr m:val="("/>
+            <m:endChr m:val=")"/>
+            <m:ctrlPr>
+              <w:rPr/>
+            </m:ctrlPr>
+          </m:dPr>
+          <m:e>
+            <m:r>
+              <w:rPr/>
+              <m:t xml:space="preserve">N-1</m:t>
+            </m:r>
+          </m:e>
+        </m:d>
+        <m:r>
+          <w:rPr/>
+          <m:t xml:space="preserve"> </m:t>
+        </m:r>
+        <m:r>
+          <w:rPr/>
+          <m:t>⋅</m:t>
+        </m:r>
+        <m:r>
+          <w:rPr/>
+          <m:t xml:space="preserve"> B</m:t>
+        </m:r>
+      </m:oMath>
+      <w:r>
+        <w:rPr>
+          <w:rtl w:val="0"/>
+        </w:rPr>
+        <w:tab/>
+        <w:t xml:space="preserve">(2)</w:t>
+      </w:r>
+    </w:p>
+    <w:p>
+      <w:pPr>
+        <w:ind w:firstLine="0"/>
+        <w:rPr/>
+      </w:pPr>
+      <w:r>
+        <w:rPr>
+          <w:rtl w:val="0"/>
+        </w:rPr>
+        <w:t xml:space="preserve">In practical terms, a session with 4 participants requires each client to maintain 3 direct connections, while a session with 8 participants requires 7 connections. As the number of participants increases, so do the demands on processing resources, because the device must simultaneously handle multiple network streams, encryption tasks, and media transmissions. At the same time, full mesh quickly becomes constrained by available upload bandwidth, especially in typical consumer internet environments.</w:t>
+      </w:r>
+    </w:p>
+    <w:p>
+      <w:pPr>
+        <w:ind w:firstLine="0"/>
+        <w:rPr/>
+      </w:pPr>
+      <w:r>
+        <w:rPr>
+          <w:rtl w:val="0"/>
+        </w:rPr>
+        <w:t xml:space="preserve">For these reasons, full mesh is typically suitable for small groups and use cases with a limited number of participants, while larger sessions are usually better served by SFU or MCU-based architectures, which distribute network and processing loads more efficiently </w:t>
+      </w:r>
+      <w:hyperlink w:anchor="iy6nbrprm6od">
+        <w:r>
+          <w:rPr>
+            <w:rtl w:val="0"/>
+          </w:rPr>
+          <w:t xml:space="preserve">[4]</w:t>
+        </w:r>
+      </w:hyperlink>
+      <w:r>
+        <w:rPr>
+          <w:rtl w:val="0"/>
+        </w:rPr>
+        <w:t xml:space="preserve">.</w:t>
+      </w:r>
+      <w:r>
+        <w:rPr>
+          <w:rtl w:val="0"/>
+        </w:rPr>
       </w:r>
     </w:p>
     <w:p>
@@ -1208,8 +1526,8 @@
           <w:bCs w:val="1"/>
         </w:rPr>
       </w:pPr>
-      <w:bookmarkStart w:colFirst="0" w:colLast="0" w:name="_yx4rk3qk65jw" w:id="5"/>
-      <w:bookmarkEnd w:id="5"/>
+      <w:bookmarkStart w:colFirst="0" w:colLast="0" w:name="_yx4rk3qk65jw" w:id="6"/>
+      <w:bookmarkEnd w:id="6"/>
       <w:r>
         <w:rPr>
           <w:rtl w:val="0"/>
@@ -1238,14 +1556,14 @@
         <w:rPr>
           <w:rtl w:val="0"/>
         </w:rPr>
-        <w:t xml:space="preserve">Signaling is not standardized in WebRTC itself but occurs out-of-band and is considered part of the application logic — the development team freely chooses protocols and message formats (e.g., REST, WebSocket, etc.). First, participants establish a connection to a common signaling channel and somehow identify the room or conversation they are participating in. Then, through that channel, they exchange SDP (Session Description Protocol) messages </w:t>
-      </w:r>
-      <w:hyperlink w:anchor="8q3b0w5r9qod">
+        <w:t xml:space="preserve">Signaling is not standardized in WebRTC itself but occurs out-of-band and is considered part of the application logic, allowing the development team to freely choose protocols and message formats (e.g., REST, WebSockets, etc.). First, participants establish a connection to a common signaling channel and somehow identify the room or conversation they are participating in. Then, through that channel, they exchange SDP (Session Description Protocol) messages </w:t>
+      </w:r>
+      <w:hyperlink w:anchor="317bxph54ncw">
         <w:r>
           <w:rPr>
             <w:rtl w:val="0"/>
           </w:rPr>
-          <w:t xml:space="preserve">[4]</w:t>
+          <w:t xml:space="preserve">[5]</w:t>
         </w:r>
       </w:hyperlink>
       <w:r>
@@ -1281,12 +1599,12 @@
           <wp:inline distB="114300" distT="114300" distL="114300" distR="114300">
             <wp:extent cx="3398400" cy="2880000"/>
             <wp:effectExtent b="0" l="0" r="0" t="0"/>
-            <wp:docPr id="11" name="image7.png"/>
+            <wp:docPr id="11" name="image2.png"/>
             <a:graphic>
               <a:graphicData uri="http://schemas.openxmlformats.org/drawingml/2006/picture">
                 <pic:pic>
                   <pic:nvPicPr>
-                    <pic:cNvPr id="0" name="image7.png"/>
+                    <pic:cNvPr id="0" name="image2.png"/>
                     <pic:cNvPicPr preferRelativeResize="0"/>
                   </pic:nvPicPr>
                   <pic:blipFill>
@@ -1316,8 +1634,8 @@
         </w:rPr>
       </w:r>
     </w:p>
-    <w:bookmarkStart w:colFirst="0" w:colLast="0" w:name="bvfb8cixho5p" w:id="6"/>
-    <w:bookmarkEnd w:id="6"/>
+    <w:bookmarkStart w:colFirst="0" w:colLast="0" w:name="bvfb8cixho5p" w:id="7"/>
+    <w:bookmarkEnd w:id="7"/>
     <w:p>
       <w:pPr>
         <w:ind w:firstLine="0"/>
@@ -1355,14 +1673,14 @@
         <w:rPr>
           <w:rtl w:val="0"/>
         </w:rPr>
-        <w:t xml:space="preserve">After the basic session configuration has been exchanged via signaling, the second phase follows — connection setup, in which WebRTC attempts to establish a feasible network path between participants. In real-world conditions, most clients do not have a public IP address but are located behind routers, NAT (Network Address Translation) devices, and firewalls, which prevents direct addressing between two endpoints. To achieve peer-to-peer communication despite this, WebRTC uses a combination of the ICE (Interactive Connectivity Establishment) </w:t>
-      </w:r>
-      <w:hyperlink w:anchor="u10sn56o268o">
+        <w:t xml:space="preserve">After the basic session configuration has been exchanged via signaling, the second phase focuses on connection setup, in which WebRTC attempts to establish a feasible network path between participants. In real-world conditions, most clients do not have a public IP address but are located behind routers, NAT (Network Address Translation) devices, and firewalls, which prevents direct addressing between two endpoints. To achieve peer-to-peer communication despite this, WebRTC uses a combination of the ICE (Interactive Connectivity Establishment) </w:t>
+      </w:r>
+      <w:hyperlink w:anchor="wlaein5832zi">
         <w:r>
           <w:rPr>
             <w:rtl w:val="0"/>
           </w:rPr>
-          <w:t xml:space="preserve">[9]</w:t>
+          <w:t xml:space="preserve">[6]</w:t>
         </w:r>
       </w:hyperlink>
       <w:r>
@@ -1371,12 +1689,12 @@
         </w:rPr>
         <w:t xml:space="preserve"> framework and STUN (Session Traversal Utilities for NAT) </w:t>
       </w:r>
-      <w:hyperlink w:anchor="tboo8a6eh01h">
+      <w:hyperlink w:anchor="ijst93fwutj">
         <w:r>
           <w:rPr>
             <w:rtl w:val="0"/>
           </w:rPr>
-          <w:t xml:space="preserve">[10]</w:t>
+          <w:t xml:space="preserve">[7]</w:t>
         </w:r>
       </w:hyperlink>
       <w:r>
@@ -1385,12 +1703,12 @@
         </w:rPr>
         <w:t xml:space="preserve"> and TURN (Traversal Using Relays around NAT) </w:t>
       </w:r>
-      <w:hyperlink w:anchor="81p4pf3ajnnn">
+      <w:hyperlink w:anchor="8ox9rrfefkwv">
         <w:r>
           <w:rPr>
             <w:rtl w:val="0"/>
           </w:rPr>
-          <w:t xml:space="preserve">[5]</w:t>
+          <w:t xml:space="preserve">[8]</w:t>
         </w:r>
       </w:hyperlink>
       <w:r>
@@ -1409,7 +1727,7 @@
         <w:rPr>
           <w:rtl w:val="0"/>
         </w:rPr>
-        <w:t xml:space="preserve">ICE gathers various network “candidates” on each side — so-called ICE candidates — which include local addresses, public addresses obtained via STUN servers, and, if necessary, relay addresses obtained via TURN servers. These candidates are then exchanged via the signaling channel and systematically tested to find a pair of candidates through which bidirectional communication can be established with the lowest possible latency. Testing of candidate pairs (connectivity checks) is shown in Figure </w:t>
+        <w:t xml:space="preserve">ICE gathers various network addresses on each side, known as ICE candidates, which include local addresses, public addresses obtained via STUN servers, and, if necessary, relay addresses obtained via TURN servers. These candidates are then exchanged via the signaling channel and systematically tested to find a pair of candidates through which bidirectional communication can be established with the lowest possible latency. Testing of candidate pairs (connectivity checks) is shown in Figure </w:t>
       </w:r>
       <w:hyperlink w:anchor="bnb34bieg7xv">
         <w:r>
@@ -1441,12 +1759,12 @@
           <wp:inline distB="114300" distT="114300" distL="114300" distR="114300">
             <wp:extent cx="2053350" cy="3240000"/>
             <wp:effectExtent b="0" l="0" r="0" t="0"/>
-            <wp:docPr id="12" name="image10.png"/>
+            <wp:docPr id="12" name="image11.png"/>
             <a:graphic>
               <a:graphicData uri="http://schemas.openxmlformats.org/drawingml/2006/picture">
                 <pic:pic>
                   <pic:nvPicPr>
-                    <pic:cNvPr id="0" name="image10.png"/>
+                    <pic:cNvPr id="0" name="image11.png"/>
                     <pic:cNvPicPr preferRelativeResize="0"/>
                   </pic:nvPicPr>
                   <pic:blipFill>
@@ -1476,8 +1794,8 @@
         </w:rPr>
       </w:r>
     </w:p>
-    <w:bookmarkStart w:colFirst="0" w:colLast="0" w:name="bnb34bieg7xv" w:id="7"/>
-    <w:bookmarkEnd w:id="7"/>
+    <w:bookmarkStart w:colFirst="0" w:colLast="0" w:name="bnb34bieg7xv" w:id="8"/>
+    <w:bookmarkEnd w:id="8"/>
     <w:p>
       <w:pPr>
         <w:ind w:firstLine="0"/>
@@ -1519,12 +1837,12 @@
         </w:rPr>
         <w:t xml:space="preserve">In the third phase, connection securing, WebRTC ensures that all media and data streams are transmitted securely. For this purpose, it uses a combination of two protocols: DTLS (Datagram Transport Layer Security) </w:t>
       </w:r>
-      <w:hyperlink w:anchor="771efax98nz4">
+      <w:hyperlink w:anchor="7z2s14o39gn0">
         <w:r>
           <w:rPr>
             <w:rtl w:val="0"/>
           </w:rPr>
-          <w:t xml:space="preserve">[7]</w:t>
+          <w:t xml:space="preserve">[9]</w:t>
         </w:r>
       </w:hyperlink>
       <w:r>
@@ -1533,12 +1851,12 @@
         </w:rPr>
         <w:t xml:space="preserve"> and SRTP (Secure Real-time Transport Protocol) </w:t>
       </w:r>
-      <w:hyperlink w:anchor="yjc6wp1gzevb">
+      <w:hyperlink w:anchor="h66rjy8hg6ti">
         <w:r>
           <w:rPr>
             <w:rtl w:val="0"/>
           </w:rPr>
-          <w:t xml:space="preserve">[3]</w:t>
+          <w:t xml:space="preserve">[10]</w:t>
         </w:r>
       </w:hyperlink>
       <w:r>
@@ -1547,53 +1865,7 @@
         </w:rPr>
         <w:t xml:space="preserve">. DTLS is the UDP version of TLS used in HTTPS, responsible for securely negotiating cryptographic parameters and exchanging keys over unreliable UDP, thereby protecting against eavesdropping, message forgery, and their modification during transmission. SRTP extends RTP by adding encryption of media packet contents, integrity checking, and protection against replay attacks, while remaining lightweight enough to meet real-time communication requirements. In WebRTC, the keys used in SRTP are not sent as plain text but are derived from the DTLS session </w:t>
       </w:r>
-      <w:hyperlink w:anchor="jwv7qos6hnl0">
-        <w:r>
-          <w:rPr>
-            <w:rtl w:val="0"/>
-          </w:rPr>
-          <w:t xml:space="preserve">[2]</w:t>
-        </w:r>
-      </w:hyperlink>
-      <w:hyperlink w:anchor="3elz847hzigg">
-        <w:r>
-          <w:rPr>
-            <w:rtl w:val="0"/>
-          </w:rPr>
-          <w:t xml:space="preserve">[8]</w:t>
-        </w:r>
-      </w:hyperlink>
-      <w:r>
-        <w:rPr>
-          <w:rtl w:val="0"/>
-        </w:rPr>
-        <w:t xml:space="preserve"> in a process known as DTLS-SRTP — first, a secure DTLS channel is established between participants, then the necessary key material for SRTP is generated from it, and after that, </w:t>
-      </w:r>
-      <w:r>
-        <w:rPr>
-          <w:rtl w:val="0"/>
-        </w:rPr>
-        <w:t xml:space="preserve">audio and video streams are encrypted and transmitted via SRTP</w:t>
-      </w:r>
-      <w:r>
-        <w:rPr>
-          <w:rtl w:val="0"/>
-        </w:rPr>
-        <w:t xml:space="preserve">. This makes WebRTC require all media traffic to be encrypted and authenticated, with no possibility of disabling encryption in production implementations, thereby ensuring end-users a high level of communication confidentiality and protection.</w:t>
-      </w:r>
-    </w:p>
-    <w:p>
-      <w:pPr>
-        <w:ind w:left="0" w:firstLine="0"/>
-        <w:rPr/>
-      </w:pPr>
-      <w:r>
-        <w:rPr>
-          <w:rtl w:val="0"/>
-        </w:rPr>
-        <w:t xml:space="preserve">In the fourth and final phase, actual communication takes place. WebRTC uses two protocols for actual data exchange between participants: RTP </w:t>
-      </w:r>
-      <w:hyperlink w:anchor="owyroi7qj1u8">
+      <w:hyperlink w:anchor="xm6ic1nmesg1">
         <w:r>
           <w:rPr>
             <w:rtl w:val="0"/>
@@ -1605,14 +1877,52 @@
         <w:rPr>
           <w:rtl w:val="0"/>
         </w:rPr>
-        <w:t xml:space="preserve"> and SCTP </w:t>
-      </w:r>
-      <w:hyperlink w:anchor="pubx4x9yx3oz">
+        <w:t xml:space="preserve"> in a process known as DTLS-SRTP — first, a secure DTLS channel is established between participants, then the necessary key material for SRTP is generated from it, and after that, </w:t>
+      </w:r>
+      <w:r>
+        <w:rPr>
+          <w:rtl w:val="0"/>
+        </w:rPr>
+        <w:t xml:space="preserve">audio and video streams are encrypted and transmitted via SRTP</w:t>
+      </w:r>
+      <w:r>
+        <w:rPr>
+          <w:rtl w:val="0"/>
+        </w:rPr>
+        <w:t xml:space="preserve">. This makes WebRTC require all media traffic to be encrypted and authenticated, with no possibility of disabling encryption in production implementations, thereby ensuring end-users a high level of communication confidentiality and protection.</w:t>
+      </w:r>
+    </w:p>
+    <w:p>
+      <w:pPr>
+        <w:ind w:left="0" w:firstLine="0"/>
+        <w:rPr/>
+      </w:pPr>
+      <w:r>
+        <w:rPr>
+          <w:rtl w:val="0"/>
+        </w:rPr>
+        <w:t xml:space="preserve">In the fourth and final phase, actual communication takes place. WebRTC uses two protocols for actual data exchange between participants: RTP </w:t>
+      </w:r>
+      <w:hyperlink w:anchor="ykt0183k3jp">
         <w:r>
           <w:rPr>
             <w:rtl w:val="0"/>
           </w:rPr>
           <w:t xml:space="preserve">[12]</w:t>
+        </w:r>
+      </w:hyperlink>
+      <w:r>
+        <w:rPr>
+          <w:rtl w:val="0"/>
+        </w:rPr>
+        <w:t xml:space="preserve"> and SCTP </w:t>
+      </w:r>
+      <w:hyperlink w:anchor="f631p3nhuc8t">
+        <w:r>
+          <w:rPr>
+            <w:rtl w:val="0"/>
+          </w:rPr>
+          <w:t xml:space="preserve">[13]</w:t>
         </w:r>
       </w:hyperlink>
       <w:r>
@@ -1634,8 +1944,8 @@
           <w:bCs w:val="1"/>
         </w:rPr>
       </w:pPr>
-      <w:bookmarkStart w:colFirst="0" w:colLast="0" w:name="_rxjk0rw4vm3j" w:id="8"/>
-      <w:bookmarkEnd w:id="8"/>
+      <w:bookmarkStart w:colFirst="0" w:colLast="0" w:name="_rxjk0rw4vm3j" w:id="9"/>
+      <w:bookmarkEnd w:id="9"/>
       <w:r>
         <w:rPr>
           <w:rtl w:val="0"/>
@@ -1654,12 +1964,12 @@
         </w:rPr>
         <w:t xml:space="preserve">This section presents WebRTC implementation within the tutoring web application developed in </w:t>
       </w:r>
-      <w:hyperlink w:anchor="edet4881e1gr">
+      <w:hyperlink w:anchor="57rv0g9tdapp">
         <w:r>
           <w:rPr>
             <w:rtl w:val="0"/>
           </w:rPr>
-          <w:t xml:space="preserve">[6]</w:t>
+          <w:t xml:space="preserve">[14]</w:t>
         </w:r>
       </w:hyperlink>
       <w:r>
@@ -1672,19 +1982,31 @@
         <w:rPr>
           <w:rtl w:val="0"/>
         </w:rPr>
-        <w:t xml:space="preserve">that connects students and tutors, facilitating the organization and management of online and onsite tutoring sessions. The application enables students to easily find and book tutoring sessions, while tutors can efficiently manage their own schedules, offers, and bookings. Participation in online tutoring sessions is supported by integration of peer-to-peer WebRTC technology for video calls. The full-stack web application was developed in the React development framework Next.js, while a relational PostgreSQL database managed via Prisma ORM and hosted on the Supabase platform is used for data storage.</w:t>
+        <w:t xml:space="preserve">that connects students and tutors, facilitating the organization and management of online and onsite tutoring sessions. The application enables students to easily find and book tutoring sessions, while tutors can efficiently manage their own schedules, offers, and bookings. Participation in online tutoring sessions is supported by integration of peer-to-peer WebRTC technology for video calls. The full-stack web application was developed in the React development framework Next.js, while a relational PostgreSQL database managed via Prisma ORM and hosted on the Supabase platform is used for data storage. </w:t>
       </w:r>
     </w:p>
     <w:p>
       <w:pPr>
-        <w:ind w:left="0" w:firstLine="0"/>
+        <w:ind w:firstLine="0"/>
         <w:rPr/>
       </w:pPr>
       <w:r>
         <w:rPr>
           <w:rtl w:val="0"/>
         </w:rPr>
-        <w:t xml:space="preserve">Since WebRTC does not specify the signaling method, this application uses the real-time functionalities of the Supabase platform as the signaling channel. This means that the messages needed to establish the connection are exchanged via the Supabase real-time channel, while the media streams themselves (audio and video) are established directly between participants' browsers after agreeing on the parameters. In this way, the data layer (Supabase/PostgreSQL) and the communication layer (WebRTC) are integrated into a whole — Supabase ensures reliable and scalable exchange of signaling messages, while WebRTC handles real-time multimedia transmission.</w:t>
+        <w:t xml:space="preserve">Specifically, the database stores user profile data and roles (students and tutors), tutor availability schedules, and academic subjects. It also manages transactional application data, including lesson offers, scheduling reservations with their respective lifecycles (pending, confirmed, or cancelled), and user reviews. Since WebRTC does not specify the signaling method, this system integrates the data layer with a real-time communication infrastructure. To ensure low latency, temporary signaling metadata required for WebRTC connection establishment (such as SDP offers/answers and ICE candidates) is exchanged dynamically in real-time via Supabase Realtime broadcast channels without being persistently stored in the database.</w:t>
+      </w:r>
+    </w:p>
+    <w:p>
+      <w:pPr>
+        <w:ind w:firstLine="0"/>
+        <w:rPr/>
+      </w:pPr>
+      <w:r>
+        <w:rPr>
+          <w:rtl w:val="0"/>
+        </w:rPr>
+        <w:t xml:space="preserve">Through these channels, the necessary connection parameters are negotiated, while the multimedia streams (audio and video) are subsequently established directly between the participants' browsers. Communication channels are strictly isolated using a unique room identifier. For direct one-on-one sessions, this identifier corresponds to the specific reservation ID, whereas for group or slot-based lessons, it is generated deterministically from the lesson offer identifier and the scheduled time slot. This cohesive architecture primarily serves to authenticate users, manage scheduling logistics, and securely isolate signaling channels before the direct peer-to-peer connection is established.</w:t>
       </w:r>
     </w:p>
     <w:p>
@@ -1740,12 +2062,12 @@
           <wp:inline distB="114300" distT="114300" distL="114300" distR="114300">
             <wp:extent cx="5760000" cy="1767600"/>
             <wp:effectExtent b="0" l="0" r="0" t="0"/>
-            <wp:docPr id="15" name="image9.png"/>
+            <wp:docPr id="15" name="image5.png"/>
             <a:graphic>
               <a:graphicData uri="http://schemas.openxmlformats.org/drawingml/2006/picture">
                 <pic:pic>
                   <pic:nvPicPr>
-                    <pic:cNvPr id="0" name="image9.png"/>
+                    <pic:cNvPr id="0" name="image5.png"/>
                     <pic:cNvPicPr preferRelativeResize="0"/>
                   </pic:nvPicPr>
                   <pic:blipFill>
@@ -1775,8 +2097,8 @@
         </w:rPr>
       </w:r>
     </w:p>
-    <w:bookmarkStart w:colFirst="0" w:colLast="0" w:name="di2villfpwvi" w:id="9"/>
-    <w:bookmarkEnd w:id="9"/>
+    <w:bookmarkStart w:colFirst="0" w:colLast="0" w:name="di2villfpwvi" w:id="10"/>
+    <w:bookmarkEnd w:id="10"/>
     <w:p>
       <w:pPr>
         <w:ind w:firstLine="0"/>
@@ -1930,7 +2252,7 @@
         <w:rPr>
           <w:rtl w:val="0"/>
         </w:rPr>
-        <w:t xml:space="preserve">Supabase channels are used for exchanging signaling messages; above them is defined a module with message schemas (e.g., </w:t>
+        <w:t xml:space="preserve">Supabase channels are used for exchanging signaling messages, supported by a dedicated module with message schemas (e.g., </w:t>
       </w:r>
       <w:r>
         <w:rPr>
@@ -1977,12 +2299,12 @@
         </w:rPr>
         <w:t xml:space="preserve">) that handles serialization and validation. The WebRTC session lifecycle follows the standard pattern: the initiator creates an offer </w:t>
       </w:r>
-      <w:hyperlink w:anchor="x501v9ofrj6a">
+      <w:hyperlink w:anchor="4dgqvvezbdt1">
         <w:r>
           <w:rPr>
             <w:rtl w:val="0"/>
           </w:rPr>
-          <w:t xml:space="preserve">[13]</w:t>
+          <w:t xml:space="preserve">[15]</w:t>
         </w:r>
       </w:hyperlink>
       <w:r>
@@ -2155,7 +2477,7 @@
           <mc:Choice Requires="wpg">
             <w:drawing>
               <wp:inline distB="114300" distT="114300" distL="114300" distR="114300">
-                <wp:extent cx="5759140" cy="970962"/>
+                <wp:extent cx="5759140" cy="942405"/>
                 <wp:effectExtent b="0" l="0" r="0" t="0"/>
                 <wp:docPr id="3" name=""/>
                 <a:graphic>
@@ -2166,7 +2488,7 @@
                       <wps:spPr>
                         <a:xfrm>
                           <a:off x="140575" y="438375"/>
-                          <a:ext cx="5743500" cy="951000"/>
+                          <a:ext cx="5743500" cy="927300"/>
                         </a:xfrm>
                         <a:prstGeom prst="rect">
                           <a:avLst/>
@@ -2768,7 +3090,7 @@
           <mc:Fallback>
             <w:drawing>
               <wp:inline distB="114300" distT="114300" distL="114300" distR="114300">
-                <wp:extent cx="5759140" cy="970962"/>
+                <wp:extent cx="5759140" cy="942405"/>
                 <wp:effectExtent b="0" l="0" r="0" t="0"/>
                 <wp:docPr id="3" name="image17.png"/>
                 <a:graphic>
@@ -2788,7 +3110,7 @@
                       <pic:spPr>
                         <a:xfrm>
                           <a:off x="0" y="0"/>
-                          <a:ext cx="5759140" cy="970962"/>
+                          <a:ext cx="5759140" cy="942405"/>
                         </a:xfrm>
                         <a:prstGeom prst="rect"/>
                         <a:ln/>
@@ -2807,8 +3129,8 @@
         </w:rPr>
       </w:r>
     </w:p>
-    <w:bookmarkStart w:colFirst="0" w:colLast="0" w:name="bdkl4ceqvm2f" w:id="10"/>
-    <w:bookmarkEnd w:id="10"/>
+    <w:bookmarkStart w:colFirst="0" w:colLast="0" w:name="bdkl4ceqvm2f" w:id="11"/>
+    <w:bookmarkEnd w:id="11"/>
     <w:p>
       <w:pPr>
         <w:ind w:left="0" w:firstLine="0"/>
@@ -2889,8 +3211,8 @@
           <w:numId w:val="2"/>
         </w:numPr>
       </w:pPr>
-      <w:bookmarkStart w:colFirst="0" w:colLast="0" w:name="_1u0adl6wpmep" w:id="11"/>
-      <w:bookmarkEnd w:id="11"/>
+      <w:bookmarkStart w:colFirst="0" w:colLast="0" w:name="_1u0adl6wpmep" w:id="12"/>
+      <w:bookmarkEnd w:id="12"/>
       <w:r>
         <w:rPr>
           <w:rtl w:val="0"/>
@@ -2936,7 +3258,7 @@
           <mc:Choice Requires="wpg">
             <w:drawing>
               <wp:inline distB="114300" distT="114300" distL="114300" distR="114300">
-                <wp:extent cx="5759140" cy="1641706"/>
+                <wp:extent cx="5759140" cy="1668044"/>
                 <wp:effectExtent b="0" l="0" r="0" t="0"/>
                 <wp:docPr id="8" name=""/>
                 <a:graphic>
@@ -2947,7 +3269,7 @@
                       <wps:spPr>
                         <a:xfrm>
                           <a:off x="140575" y="471925"/>
-                          <a:ext cx="6227100" cy="1764600"/>
+                          <a:ext cx="6227100" cy="1787400"/>
                         </a:xfrm>
                         <a:prstGeom prst="rect">
                           <a:avLst/>
@@ -3983,7 +4305,7 @@
           <mc:Fallback>
             <w:drawing>
               <wp:inline distB="114300" distT="114300" distL="114300" distR="114300">
-                <wp:extent cx="5759140" cy="1641706"/>
+                <wp:extent cx="5759140" cy="1668044"/>
                 <wp:effectExtent b="0" l="0" r="0" t="0"/>
                 <wp:docPr id="8" name="image22.png"/>
                 <a:graphic>
@@ -4003,7 +4325,7 @@
                       <pic:spPr>
                         <a:xfrm>
                           <a:off x="0" y="0"/>
-                          <a:ext cx="5759140" cy="1641706"/>
+                          <a:ext cx="5759140" cy="1668044"/>
                         </a:xfrm>
                         <a:prstGeom prst="rect"/>
                         <a:ln/>
@@ -4022,8 +4344,8 @@
         </w:rPr>
       </w:r>
     </w:p>
-    <w:bookmarkStart w:colFirst="0" w:colLast="0" w:name="5ya0o68c0rzj" w:id="12"/>
-    <w:bookmarkEnd w:id="12"/>
+    <w:bookmarkStart w:colFirst="0" w:colLast="0" w:name="5ya0o68c0rzj" w:id="13"/>
+    <w:bookmarkEnd w:id="13"/>
     <w:p>
       <w:pPr>
         <w:ind w:firstLine="0"/>
@@ -4149,8 +4471,8 @@
           <w:numId w:val="2"/>
         </w:numPr>
       </w:pPr>
-      <w:bookmarkStart w:colFirst="0" w:colLast="0" w:name="_8ek5et2u6zc" w:id="13"/>
-      <w:bookmarkEnd w:id="13"/>
+      <w:bookmarkStart w:colFirst="0" w:colLast="0" w:name="_8ek5et2u6zc" w:id="14"/>
+      <w:bookmarkEnd w:id="14"/>
       <w:r>
         <w:rPr>
           <w:rtl w:val="0"/>
@@ -5037,8 +5359,8 @@
         </w:rPr>
       </w:r>
     </w:p>
-    <w:bookmarkStart w:colFirst="0" w:colLast="0" w:name="q7osjsa1aznh" w:id="14"/>
-    <w:bookmarkEnd w:id="14"/>
+    <w:bookmarkStart w:colFirst="0" w:colLast="0" w:name="q7osjsa1aznh" w:id="15"/>
+    <w:bookmarkEnd w:id="15"/>
     <w:p>
       <w:pPr>
         <w:ind w:firstLine="0"/>
@@ -6630,8 +6952,8 @@
         </w:rPr>
       </w:r>
     </w:p>
-    <w:bookmarkStart w:colFirst="0" w:colLast="0" w:name="tbr6fxi803mb" w:id="15"/>
-    <w:bookmarkEnd w:id="15"/>
+    <w:bookmarkStart w:colFirst="0" w:colLast="0" w:name="tbr6fxi803mb" w:id="16"/>
+    <w:bookmarkEnd w:id="16"/>
     <w:p>
       <w:pPr>
         <w:ind w:firstLine="0"/>
@@ -6727,8 +7049,8 @@
           <w:numId w:val="2"/>
         </w:numPr>
       </w:pPr>
-      <w:bookmarkStart w:colFirst="0" w:colLast="0" w:name="_8gkyk6k7doxb" w:id="16"/>
-      <w:bookmarkEnd w:id="16"/>
+      <w:bookmarkStart w:colFirst="0" w:colLast="0" w:name="_8gkyk6k7doxb" w:id="17"/>
+      <w:bookmarkEnd w:id="17"/>
       <w:r>
         <w:rPr>
           <w:rtl w:val="0"/>
@@ -7991,8 +8313,8 @@
         </w:rPr>
       </w:r>
     </w:p>
-    <w:bookmarkStart w:colFirst="0" w:colLast="0" w:name="jpwu86ap8d40" w:id="17"/>
-    <w:bookmarkEnd w:id="17"/>
+    <w:bookmarkStart w:colFirst="0" w:colLast="0" w:name="jpwu86ap8d40" w:id="18"/>
+    <w:bookmarkEnd w:id="18"/>
     <w:p>
       <w:pPr>
         <w:ind w:firstLine="0"/>
@@ -9123,8 +9445,8 @@
         </w:rPr>
       </w:r>
     </w:p>
-    <w:bookmarkStart w:colFirst="0" w:colLast="0" w:name="pgru5acecaa9" w:id="18"/>
-    <w:bookmarkEnd w:id="18"/>
+    <w:bookmarkStart w:colFirst="0" w:colLast="0" w:name="pgru5acecaa9" w:id="19"/>
+    <w:bookmarkEnd w:id="19"/>
     <w:p>
       <w:pPr>
         <w:ind w:firstLine="0"/>
@@ -9175,8 +9497,8 @@
           <w:numId w:val="2"/>
         </w:numPr>
       </w:pPr>
-      <w:bookmarkStart w:colFirst="0" w:colLast="0" w:name="_csmnjkdowsws" w:id="19"/>
-      <w:bookmarkEnd w:id="19"/>
+      <w:bookmarkStart w:colFirst="0" w:colLast="0" w:name="_csmnjkdowsws" w:id="20"/>
+      <w:bookmarkEnd w:id="20"/>
       <w:r>
         <w:rPr>
           <w:rtl w:val="0"/>
@@ -9964,8 +10286,8 @@
         </w:rPr>
       </w:r>
     </w:p>
-    <w:bookmarkStart w:colFirst="0" w:colLast="0" w:name="ymub6rgem0ta" w:id="20"/>
-    <w:bookmarkEnd w:id="20"/>
+    <w:bookmarkStart w:colFirst="0" w:colLast="0" w:name="ymub6rgem0ta" w:id="21"/>
+    <w:bookmarkEnd w:id="21"/>
     <w:p>
       <w:pPr>
         <w:ind w:firstLine="0"/>
@@ -10046,8 +10368,8 @@
           <w:numId w:val="2"/>
         </w:numPr>
       </w:pPr>
-      <w:bookmarkStart w:colFirst="0" w:colLast="0" w:name="_r912zj70tstp" w:id="21"/>
-      <w:bookmarkEnd w:id="21"/>
+      <w:bookmarkStart w:colFirst="0" w:colLast="0" w:name="_r912zj70tstp" w:id="22"/>
+      <w:bookmarkEnd w:id="22"/>
       <w:r>
         <w:rPr>
           <w:rtl w:val="0"/>
@@ -11783,8 +12105,8 @@
         </w:rPr>
       </w:r>
     </w:p>
-    <w:bookmarkStart w:colFirst="0" w:colLast="0" w:name="4ny2n4taxs30" w:id="22"/>
-    <w:bookmarkEnd w:id="22"/>
+    <w:bookmarkStart w:colFirst="0" w:colLast="0" w:name="4ny2n4taxs30" w:id="23"/>
+    <w:bookmarkEnd w:id="23"/>
     <w:p>
       <w:pPr>
         <w:ind w:firstLine="0"/>
@@ -11865,8 +12187,8 @@
           <w:numId w:val="2"/>
         </w:numPr>
       </w:pPr>
-      <w:bookmarkStart w:colFirst="0" w:colLast="0" w:name="_t324iklmfgkj" w:id="23"/>
-      <w:bookmarkEnd w:id="23"/>
+      <w:bookmarkStart w:colFirst="0" w:colLast="0" w:name="_t324iklmfgkj" w:id="24"/>
+      <w:bookmarkEnd w:id="24"/>
       <w:r>
         <w:rPr>
           <w:rtl w:val="0"/>
@@ -12706,8 +13028,8 @@
         </w:rPr>
       </w:r>
     </w:p>
-    <w:bookmarkStart w:colFirst="0" w:colLast="0" w:name="rmeb5d6i0dmn" w:id="24"/>
-    <w:bookmarkEnd w:id="24"/>
+    <w:bookmarkStart w:colFirst="0" w:colLast="0" w:name="rmeb5d6i0dmn" w:id="25"/>
+    <w:bookmarkEnd w:id="25"/>
     <w:p>
       <w:pPr>
         <w:ind w:firstLine="0"/>
@@ -12788,8 +13110,8 @@
           <w:numId w:val="2"/>
         </w:numPr>
       </w:pPr>
-      <w:bookmarkStart w:colFirst="0" w:colLast="0" w:name="_1vssazlh1s3w" w:id="25"/>
-      <w:bookmarkEnd w:id="25"/>
+      <w:bookmarkStart w:colFirst="0" w:colLast="0" w:name="_1vssazlh1s3w" w:id="26"/>
+      <w:bookmarkEnd w:id="26"/>
       <w:r>
         <w:rPr>
           <w:rtl w:val="0"/>
@@ -14082,8 +14404,8 @@
         </w:rPr>
       </w:r>
     </w:p>
-    <w:bookmarkStart w:colFirst="0" w:colLast="0" w:name="qo4d9pc7bj7p" w:id="26"/>
-    <w:bookmarkEnd w:id="26"/>
+    <w:bookmarkStart w:colFirst="0" w:colLast="0" w:name="qo4d9pc7bj7p" w:id="27"/>
+    <w:bookmarkEnd w:id="27"/>
     <w:p>
       <w:pPr>
         <w:ind w:firstLine="0"/>
@@ -14128,7 +14450,7 @@
       <m:oMath>
         <m:r>
           <w:rPr/>
-          <m:t xml:space="preserve">n - 1</m:t>
+          <m:t xml:space="preserve">N - 1</m:t>
         </m:r>
       </m:oMath>
       <w:r>
@@ -14155,14 +14477,14 @@
       <m:oMath>
         <m:r>
           <w:rPr/>
-          <m:t xml:space="preserve">n</m:t>
+          <m:t xml:space="preserve">N</m:t>
         </m:r>
       </m:oMath>
       <w:r>
         <w:rPr>
           <w:rtl w:val="0"/>
         </w:rPr>
-        <w:t xml:space="preserve"> is the total number of participants. Each connection independently handles offer/answer negotiation, ICE candidate exchange, and media streaming, enabling scalable multi-party communication.</w:t>
+        <w:t xml:space="preserve"> is the total number of participants. Each connection independently handles offer/answer negotiation, ICE candidate exchange, and media streaming, enabling fully decentralized multi-party communication for small-scale groups without requiring specialized media routing infrastructure.</w:t>
       </w:r>
     </w:p>
     <w:p>
@@ -14173,8 +14495,8 @@
           <w:numId w:val="2"/>
         </w:numPr>
       </w:pPr>
-      <w:bookmarkStart w:colFirst="0" w:colLast="0" w:name="_yif07p2s82u2" w:id="27"/>
-      <w:bookmarkEnd w:id="27"/>
+      <w:bookmarkStart w:colFirst="0" w:colLast="0" w:name="_yif07p2s82u2" w:id="28"/>
+      <w:bookmarkEnd w:id="28"/>
       <w:r>
         <w:rPr>
           <w:rtl w:val="0"/>
@@ -14188,8 +14510,8 @@
         <w:ind w:left="0" w:firstLine="0"/>
         <w:rPr/>
       </w:pPr>
-      <w:bookmarkStart w:colFirst="0" w:colLast="0" w:name="_9ew65ie72bmx" w:id="28"/>
-      <w:bookmarkEnd w:id="28"/>
+      <w:bookmarkStart w:colFirst="0" w:colLast="0" w:name="_9ew65ie72bmx" w:id="29"/>
+      <w:bookmarkEnd w:id="29"/>
       <w:r>
         <w:rPr>
           <w:rtl w:val="0"/>
@@ -14228,12 +14550,12 @@
           <wp:inline distB="0" distT="0" distL="114300" distR="114300">
             <wp:extent cx="2905125" cy="2470687"/>
             <wp:effectExtent b="0" l="0" r="0" t="0"/>
-            <wp:docPr id="21" name="image6.png"/>
+            <wp:docPr id="21" name="image8.png"/>
             <a:graphic>
               <a:graphicData uri="http://schemas.openxmlformats.org/drawingml/2006/picture">
                 <pic:pic>
                   <pic:nvPicPr>
-                    <pic:cNvPr id="0" name="image6.png"/>
+                    <pic:cNvPr id="0" name="image8.png"/>
                     <pic:cNvPicPr preferRelativeResize="0"/>
                   </pic:nvPicPr>
                   <pic:blipFill>
@@ -14269,12 +14591,12 @@
           <wp:inline distB="0" distT="0" distL="114300" distR="114300">
             <wp:extent cx="1647825" cy="2946937"/>
             <wp:effectExtent b="0" l="0" r="0" t="0"/>
-            <wp:docPr id="13" name="image5.jpg"/>
+            <wp:docPr id="13" name="image10.jpg"/>
             <a:graphic>
               <a:graphicData uri="http://schemas.openxmlformats.org/drawingml/2006/picture">
                 <pic:pic>
                   <pic:nvPicPr>
-                    <pic:cNvPr id="0" name="image5.jpg"/>
+                    <pic:cNvPr id="0" name="image10.jpg"/>
                     <pic:cNvPicPr preferRelativeResize="0"/>
                   </pic:nvPicPr>
                   <pic:blipFill>
@@ -14304,8 +14626,8 @@
         </w:rPr>
       </w:r>
     </w:p>
-    <w:bookmarkStart w:colFirst="0" w:colLast="0" w:name="9oeh38m0yi7n" w:id="29"/>
-    <w:bookmarkEnd w:id="29"/>
+    <w:bookmarkStart w:colFirst="0" w:colLast="0" w:name="9oeh38m0yi7n" w:id="30"/>
+    <w:bookmarkEnd w:id="30"/>
     <w:p>
       <w:pPr>
         <w:tabs>
@@ -14433,14 +14755,14 @@
         <w:rPr/>
         <w:drawing>
           <wp:inline distB="114300" distT="114300" distL="114300" distR="114300">
-            <wp:extent cx="5076000" cy="3600000"/>
+            <wp:extent cx="4822200" cy="3420000"/>
             <wp:effectExtent b="0" l="0" r="0" t="0"/>
-            <wp:docPr id="17" name="image12.png"/>
+            <wp:docPr id="17" name="image3.png"/>
             <a:graphic>
               <a:graphicData uri="http://schemas.openxmlformats.org/drawingml/2006/picture">
                 <pic:pic>
                   <pic:nvPicPr>
-                    <pic:cNvPr id="0" name="image12.png"/>
+                    <pic:cNvPr id="0" name="image3.png"/>
                     <pic:cNvPicPr preferRelativeResize="0"/>
                   </pic:nvPicPr>
                   <pic:blipFill>
@@ -14453,7 +14775,7 @@
                   <pic:spPr>
                     <a:xfrm>
                       <a:off x="0" y="0"/>
-                      <a:ext cx="5076000" cy="3600000"/>
+                      <a:ext cx="4822200" cy="3420000"/>
                     </a:xfrm>
                     <a:prstGeom prst="rect"/>
                     <a:ln/>
@@ -14470,8 +14792,8 @@
         </w:rPr>
       </w:r>
     </w:p>
-    <w:bookmarkStart w:colFirst="0" w:colLast="0" w:name="vgv04f5oihl1" w:id="30"/>
-    <w:bookmarkEnd w:id="30"/>
+    <w:bookmarkStart w:colFirst="0" w:colLast="0" w:name="vgv04f5oihl1" w:id="31"/>
+    <w:bookmarkEnd w:id="31"/>
     <w:p>
       <w:pPr>
         <w:tabs>
@@ -14534,12 +14856,12 @@
           <wp:inline distB="0" distT="0" distL="114300" distR="114300">
             <wp:extent cx="2238375" cy="4401875"/>
             <wp:effectExtent b="0" l="0" r="0" t="0"/>
-            <wp:docPr id="19" name="image11.jpg"/>
+            <wp:docPr id="19" name="image12.jpg"/>
             <a:graphic>
               <a:graphicData uri="http://schemas.openxmlformats.org/drawingml/2006/picture">
                 <pic:pic>
                   <pic:nvPicPr>
-                    <pic:cNvPr id="0" name="image11.jpg"/>
+                    <pic:cNvPr id="0" name="image12.jpg"/>
                     <pic:cNvPicPr preferRelativeResize="0"/>
                   </pic:nvPicPr>
                   <pic:blipFill>
@@ -14569,12 +14891,12 @@
           <wp:inline distB="0" distT="0" distL="114300" distR="114300">
             <wp:extent cx="2062800" cy="4320000"/>
             <wp:effectExtent b="0" l="0" r="0" t="0"/>
-            <wp:docPr id="20" name="image8.jpg"/>
+            <wp:docPr id="20" name="image6.jpg"/>
             <a:graphic>
               <a:graphicData uri="http://schemas.openxmlformats.org/drawingml/2006/picture">
                 <pic:pic>
                   <pic:nvPicPr>
-                    <pic:cNvPr id="0" name="image8.jpg"/>
+                    <pic:cNvPr id="0" name="image6.jpg"/>
                     <pic:cNvPicPr preferRelativeResize="0"/>
                   </pic:nvPicPr>
                   <pic:blipFill>
@@ -14604,8 +14926,8 @@
         </w:rPr>
       </w:r>
     </w:p>
-    <w:bookmarkStart w:colFirst="0" w:colLast="0" w:name="a9kqmpdrumth" w:id="31"/>
-    <w:bookmarkEnd w:id="31"/>
+    <w:bookmarkStart w:colFirst="0" w:colLast="0" w:name="a9kqmpdrumth" w:id="32"/>
+    <w:bookmarkEnd w:id="32"/>
     <w:p>
       <w:pPr>
         <w:tabs>
@@ -14689,8 +15011,8 @@
           <w:bCs w:val="1"/>
         </w:rPr>
       </w:pPr>
-      <w:bookmarkStart w:colFirst="0" w:colLast="0" w:name="_853ps2qlwr22" w:id="32"/>
-      <w:bookmarkEnd w:id="32"/>
+      <w:bookmarkStart w:colFirst="0" w:colLast="0" w:name="_853ps2qlwr22" w:id="33"/>
+      <w:bookmarkEnd w:id="33"/>
       <w:r>
         <w:rPr>
           <w:rtl w:val="0"/>
@@ -14701,27 +15023,84 @@
     <w:p>
       <w:pPr>
         <w:ind w:left="0" w:firstLine="0"/>
-        <w:rPr>
-          <w:rFonts w:ascii="Times New Roman" w:cs="Times New Roman" w:eastAsia="Times New Roman" w:hAnsi="Times New Roman"/>
-          <w:b w:val="0"/>
-          <w:bCs w:val="0"/>
-          <w:i w:val="0"/>
-          <w:iCs w:val="0"/>
-          <w:smallCaps w:val="0"/>
-          <w:strike w:val="0"/>
-          <w:color w:val="000000"/>
-          <w:sz w:val="24"/>
-          <w:szCs w:val="24"/>
-          <w:u w:val="none"/>
-          <w:shd w:fill="auto" w:val="clear"/>
-          <w:vertAlign w:val="baseline"/>
-        </w:rPr>
+        <w:rPr/>
       </w:pPr>
       <w:r>
         <w:rPr>
           <w:rtl w:val="0"/>
         </w:rPr>
-        <w:t xml:space="preserve">This paper presented WebRTC technology — a standardized FOSS collection of protocols enabling plugin-free peer-to-peer real-time audio, video, and data communication via modern browsers through signaling, ICE NAT traversal, DTLS-SRTP security, and RTP/SCTP transport. WebRTC was exemplified in practice through a full-stack Next.js application with Prisma ORM, PostgreSQL, and Supabase real-time signaling, serving as a student-tutor platform for online/onsite tutoring with fully meshed group video calls managed by the </w:t>
+        <w:t xml:space="preserve">This paper presented WebRTC as a practical, standardized, browser-based technology for secure real-time audio, video, and data communication. The implemented application confirmed that WebRTC can effectively support cross-device interaction in a student-tutor marketplace, while also demonstrating the benefits of peer-to-peer media exchange and application-managed signaling.</w:t>
+      </w:r>
+    </w:p>
+    <w:p>
+      <w:pPr>
+        <w:ind w:left="0" w:firstLine="0"/>
+        <w:rPr/>
+      </w:pPr>
+      <w:r>
+        <w:rPr>
+          <w:rtl w:val="0"/>
+        </w:rPr>
+        <w:t xml:space="preserve">At the same time, the evaluation showed that a full mesh topology is typically suitable for small-scale sessions, since the outbound bandwidth per client grows linearly with </w:t>
+      </w:r>
+      <m:oMath>
+        <m:r>
+          <w:rPr/>
+          <m:t xml:space="preserve">N</m:t>
+        </m:r>
+      </m:oMath>
+      <w:r>
+        <w:rPr>
+          <w:rtl w:val="0"/>
+        </w:rPr>
+        <w:t xml:space="preserve">, while the total number of network connections increases quadratically as  </w:t>
+      </w:r>
+      <m:oMath>
+        <m:r>
+          <w:rPr/>
+          <m:t xml:space="preserve">O(</m:t>
+        </m:r>
+        <m:sSup>
+          <m:sSupPr>
+            <m:ctrlPr>
+              <w:rPr/>
+            </m:ctrlPr>
+          </m:sSupPr>
+          <m:e>
+            <m:r>
+              <w:rPr/>
+              <m:t xml:space="preserve">N</m:t>
+            </m:r>
+          </m:e>
+          <m:sup>
+            <m:r>
+              <w:rPr/>
+              <m:t xml:space="preserve">2</m:t>
+            </m:r>
+          </m:sup>
+        </m:sSup>
+        <m:r>
+          <w:rPr/>
+          <m:t xml:space="preserve">)</m:t>
+        </m:r>
+      </m:oMath>
+      <w:r>
+        <w:rPr>
+          <w:rtl w:val="0"/>
+        </w:rPr>
+        <w:t xml:space="preserve"> with the number of participants. In addition, limited upload capacity, NAT traversal issues, and device-specific media and lifecycle management remain important technical challenges in real-world deployment.</w:t>
+      </w:r>
+    </w:p>
+    <w:p>
+      <w:pPr>
+        <w:ind w:firstLine="0"/>
+        <w:rPr/>
+      </w:pPr>
+      <w:r>
+        <w:rPr>
+          <w:rtl w:val="0"/>
+        </w:rPr>
+        <w:t xml:space="preserve">These findings raise several open questions for future research. Further work should focus on migrating from full mesh to an SFU-based media architecture, improving adaptive bandwidth control through </w:t>
       </w:r>
       <w:r>
         <w:rPr>
@@ -14730,13 +15109,25 @@
           <w:szCs w:val="22"/>
           <w:rtl w:val="0"/>
         </w:rPr>
-        <w:t xml:space="preserve">RoomCall</w:t>
-      </w:r>
-      <w:r>
-        <w:rPr>
-          <w:rtl w:val="0"/>
-        </w:rPr>
-        <w:t xml:space="preserve"> React component. The implementation validated seamless cross-device functionality, secure connection phases, and scalable educational video conferencing without complex infrastructure. The successful integration demonstrates that modern web-based real-time communication no longer requires proprietary solutions — standardized, open WebRTC technologies provide robust, secure, and accessible peer-to-peer multimedia exchange for contemporary web applications.</w:t>
+        <w:t xml:space="preserve">RTCRtpSender</w:t>
+      </w:r>
+      <w:r>
+        <w:rPr>
+          <w:rtl w:val="0"/>
+        </w:rPr>
+        <w:t xml:space="preserve">, and expanding signaling diagnostics to better detect and resolve ICE negotiation failures. Further investigation is also needed into how such systems behave under unstable mobile network conditions and heterogeneous device environments.</w:t>
+      </w:r>
+    </w:p>
+    <w:p>
+      <w:pPr>
+        <w:ind w:firstLine="0"/>
+        <w:rPr/>
+      </w:pPr>
+      <w:r>
+        <w:rPr>
+          <w:rtl w:val="0"/>
+        </w:rPr>
+        <w:t xml:space="preserve">Overall, the paper confirms that WebRTC provides a robust foundation for secure and scalable communication systems, but that its practical performance depends strongly on topology choice, network conditions, and implementation strategy.</w:t>
       </w:r>
       <w:r>
         <w:rPr>
@@ -14766,45 +15157,7 @@
         </w:rPr>
       </w:r>
     </w:p>
-    <w:bookmarkStart w:colFirst="0" w:colLast="0" w:name="ykr0rz9bhpss" w:id="33"/>
-    <w:bookmarkEnd w:id="33"/>
-    <w:p>
-      <w:pPr>
-        <w:numPr>
-          <w:ilvl w:val="0"/>
-          <w:numId w:val="1"/>
-        </w:numPr>
-        <w:ind w:left="720" w:hanging="360"/>
-        <w:rPr>
-          <w:sz w:val="22"/>
-          <w:szCs w:val="22"/>
-        </w:rPr>
-      </w:pPr>
-      <w:r>
-        <w:rPr>
-          <w:sz w:val="22"/>
-          <w:szCs w:val="22"/>
-          <w:rtl w:val="0"/>
-        </w:rPr>
-        <w:t xml:space="preserve">Alvestrand, H. (2021). Overview: Real-Time Protocols for Browser-Based Applications (WebRTC) (RFC 8825). </w:t>
-      </w:r>
-      <w:hyperlink r:id="rId22">
-        <w:r>
-          <w:rPr>
-            <w:sz w:val="22"/>
-            <w:szCs w:val="22"/>
-            <w:rtl w:val="0"/>
-          </w:rPr>
-          <w:t xml:space="preserve">https://datatracker.ietf.org/doc/html/rfc8825</w:t>
-        </w:r>
-      </w:hyperlink>
-      <w:r>
-        <w:rPr>
-          <w:rtl w:val="0"/>
-        </w:rPr>
-      </w:r>
-    </w:p>
-    <w:bookmarkStart w:colFirst="0" w:colLast="0" w:name="jwv7qos6hnl0" w:id="34"/>
+    <w:bookmarkStart w:colFirst="0" w:colLast="0" w:name="9h0vy7btjpko" w:id="34"/>
     <w:bookmarkEnd w:id="34"/>
     <w:p>
       <w:pPr>
@@ -14824,8 +15177,36 @@
           <w:szCs w:val="22"/>
           <w:rtl w:val="0"/>
         </w:rPr>
-        <w:t xml:space="preserve">Alvestrand, H. (2021). WebRTC Media Transport Independent Security Requirements (RFC 8830). </w:t>
-      </w:r>
+        <w:t xml:space="preserve">Alvestrand, H. (2021). </w:t>
+      </w:r>
+      <w:r>
+        <w:rPr>
+          <w:i w:val="1"/>
+          <w:iCs w:val="1"/>
+          <w:sz w:val="22"/>
+          <w:szCs w:val="22"/>
+          <w:rtl w:val="0"/>
+        </w:rPr>
+        <w:t xml:space="preserve">Overview: Real-Time Protocols for Browser-Based Applications (Request for Comments 8825)</w:t>
+      </w:r>
+      <w:r>
+        <w:rPr>
+          <w:sz w:val="22"/>
+          <w:szCs w:val="22"/>
+          <w:rtl w:val="0"/>
+        </w:rPr>
+        <w:t xml:space="preserve">.</w:t>
+      </w:r>
+      <w:hyperlink r:id="rId22">
+        <w:r>
+          <w:rPr>
+            <w:sz w:val="22"/>
+            <w:szCs w:val="22"/>
+            <w:rtl w:val="0"/>
+          </w:rPr>
+          <w:t xml:space="preserve"> </w:t>
+        </w:r>
+      </w:hyperlink>
       <w:hyperlink r:id="rId23">
         <w:r>
           <w:rPr>
@@ -14833,7 +15214,7 @@
             <w:szCs w:val="22"/>
             <w:rtl w:val="0"/>
           </w:rPr>
-          <w:t xml:space="preserve">https://datatracker.ietf.org/doc/html/rfc8830</w:t>
+          <w:t xml:space="preserve">https://www.rfc-editor.org/info/rfc8825</w:t>
         </w:r>
       </w:hyperlink>
       <w:r>
@@ -14842,7 +15223,7 @@
         </w:rPr>
       </w:r>
     </w:p>
-    <w:bookmarkStart w:colFirst="0" w:colLast="0" w:name="yjc6wp1gzevb" w:id="35"/>
+    <w:bookmarkStart w:colFirst="0" w:colLast="0" w:name="19tmmbrp53k4" w:id="35"/>
     <w:bookmarkEnd w:id="35"/>
     <w:p>
       <w:pPr>
@@ -14862,7 +15243,25 @@
           <w:szCs w:val="22"/>
           <w:rtl w:val="0"/>
         </w:rPr>
-        <w:t xml:space="preserve">Baugher, M., McGrew, D., Naslund, M., Carrara, E., &amp; Norrman, K. (2004). The Secure Real-time Transport Protocol (SRTP) (RFC 3711). </w:t>
+        <w:t xml:space="preserve">World Wide Web Consortium. (2025). </w:t>
+      </w:r>
+      <w:r>
+        <w:rPr>
+          <w:i w:val="1"/>
+          <w:iCs w:val="1"/>
+          <w:sz w:val="22"/>
+          <w:szCs w:val="22"/>
+          <w:rtl w:val="0"/>
+        </w:rPr>
+        <w:t xml:space="preserve">WebRTC: Real-Time Communication in Browsers (Recommendation)</w:t>
+      </w:r>
+      <w:r>
+        <w:rPr>
+          <w:sz w:val="22"/>
+          <w:szCs w:val="22"/>
+          <w:rtl w:val="0"/>
+        </w:rPr>
+        <w:t xml:space="preserve">.</w:t>
       </w:r>
       <w:hyperlink r:id="rId24">
         <w:r>
@@ -14871,7 +15270,7 @@
             <w:szCs w:val="22"/>
             <w:rtl w:val="0"/>
           </w:rPr>
-          <w:t xml:space="preserve">https://datatracker.ietf.org/doc/html/rfc3711</w:t>
+          <w:t xml:space="preserve"> https://www.w3.org/TR/webrtc/</w:t>
         </w:r>
       </w:hyperlink>
       <w:r>
@@ -14880,7 +15279,7 @@
         </w:rPr>
       </w:r>
     </w:p>
-    <w:bookmarkStart w:colFirst="0" w:colLast="0" w:name="8q3b0w5r9qod" w:id="36"/>
+    <w:bookmarkStart w:colFirst="0" w:colLast="0" w:name="b5pncglaaxk" w:id="36"/>
     <w:bookmarkEnd w:id="36"/>
     <w:p>
       <w:pPr>
@@ -14900,7 +15299,25 @@
           <w:szCs w:val="22"/>
           <w:rtl w:val="0"/>
         </w:rPr>
-        <w:t xml:space="preserve">Handley, M., Jacobson, V., &amp; Perkins, C. (2006). SDP: Session Description Protocol (RFC 4566). </w:t>
+        <w:t xml:space="preserve">Westerlund, M., &amp; Wenger, S. (2015). </w:t>
+      </w:r>
+      <w:r>
+        <w:rPr>
+          <w:i w:val="1"/>
+          <w:iCs w:val="1"/>
+          <w:sz w:val="22"/>
+          <w:szCs w:val="22"/>
+          <w:rtl w:val="0"/>
+        </w:rPr>
+        <w:t xml:space="preserve">RTP Topologies (Request for Comments 7667)</w:t>
+      </w:r>
+      <w:r>
+        <w:rPr>
+          <w:sz w:val="22"/>
+          <w:szCs w:val="22"/>
+          <w:rtl w:val="0"/>
+        </w:rPr>
+        <w:t xml:space="preserve">.</w:t>
       </w:r>
       <w:hyperlink r:id="rId25">
         <w:r>
@@ -14909,7 +15326,7 @@
             <w:szCs w:val="22"/>
             <w:rtl w:val="0"/>
           </w:rPr>
-          <w:t xml:space="preserve">https://datatracker.ietf.org/doc/html/rfc4566</w:t>
+          <w:t xml:space="preserve"> https://www.rfc-editor.org/info/rfc7667</w:t>
         </w:r>
       </w:hyperlink>
       <w:r>
@@ -14918,7 +15335,7 @@
         </w:rPr>
       </w:r>
     </w:p>
-    <w:bookmarkStart w:colFirst="0" w:colLast="0" w:name="81p4pf3ajnnn" w:id="37"/>
+    <w:bookmarkStart w:colFirst="0" w:colLast="0" w:name="iy6nbrprm6od" w:id="37"/>
     <w:bookmarkEnd w:id="37"/>
     <w:p>
       <w:pPr>
@@ -14930,6 +15347,7 @@
         <w:rPr>
           <w:sz w:val="22"/>
           <w:szCs w:val="22"/>
+          <w:u w:val="none"/>
         </w:rPr>
       </w:pPr>
       <w:r>
@@ -14938,7 +15356,43 @@
           <w:szCs w:val="22"/>
           <w:rtl w:val="0"/>
         </w:rPr>
-        <w:t xml:space="preserve">Mahy, R., Matthews, P., &amp; Rosenberg, J. (2010). Traversal Using Relays around NAT (TURN) (RFC 5766). </w:t>
+        <w:t xml:space="preserve">Jansen, B., Goodwin, T., Gupta, V., Kuipers, F., &amp; Zussman, G. (2018). Performance Evaluation of WebRTC-based Video Conferencing. </w:t>
+      </w:r>
+      <w:r>
+        <w:rPr>
+          <w:i w:val="1"/>
+          <w:iCs w:val="1"/>
+          <w:sz w:val="22"/>
+          <w:szCs w:val="22"/>
+          <w:rtl w:val="0"/>
+        </w:rPr>
+        <w:t xml:space="preserve">Association for Computing Machinery Special Interest Group on Metrics Performance Evaluation Review</w:t>
+      </w:r>
+      <w:r>
+        <w:rPr>
+          <w:sz w:val="22"/>
+          <w:szCs w:val="22"/>
+          <w:rtl w:val="0"/>
+        </w:rPr>
+        <w:t xml:space="preserve">, </w:t>
+      </w:r>
+      <w:r>
+        <w:rPr>
+          <w:i w:val="1"/>
+          <w:iCs w:val="1"/>
+          <w:sz w:val="22"/>
+          <w:szCs w:val="22"/>
+          <w:rtl w:val="0"/>
+        </w:rPr>
+        <w:t xml:space="preserve">45</w:t>
+      </w:r>
+      <w:r>
+        <w:rPr>
+          <w:sz w:val="22"/>
+          <w:szCs w:val="22"/>
+          <w:rtl w:val="0"/>
+        </w:rPr>
+        <w:t xml:space="preserve">(3), 56–68.</w:t>
       </w:r>
       <w:hyperlink r:id="rId26">
         <w:r>
@@ -14947,7 +15401,7 @@
             <w:szCs w:val="22"/>
             <w:rtl w:val="0"/>
           </w:rPr>
-          <w:t xml:space="preserve">https://datatracker.ietf.org/doc/html/rfc5766</w:t>
+          <w:t xml:space="preserve"> https://doi.org/10.1145/3199524.3199534</w:t>
         </w:r>
       </w:hyperlink>
       <w:r>
@@ -14956,7 +15410,7 @@
         </w:rPr>
       </w:r>
     </w:p>
-    <w:bookmarkStart w:colFirst="0" w:colLast="0" w:name="edet4881e1gr" w:id="38"/>
+    <w:bookmarkStart w:colFirst="0" w:colLast="0" w:name="317bxph54ncw" w:id="38"/>
     <w:bookmarkEnd w:id="38"/>
     <w:p>
       <w:pPr>
@@ -14968,7 +15422,6 @@
         <w:rPr>
           <w:sz w:val="22"/>
           <w:szCs w:val="22"/>
-          <w:u w:val="none"/>
         </w:rPr>
       </w:pPr>
       <w:r>
@@ -14977,7 +15430,25 @@
           <w:szCs w:val="22"/>
           <w:rtl w:val="0"/>
         </w:rPr>
-        <w:t xml:space="preserve">Papić, A. (2026). Razvoj web aplikacije za repeticije. Diplomski rad. Sveučilište u Splitu, Sveučilišni odjel za stručne studije, Split. </w:t>
+        <w:t xml:space="preserve">Begen, A., Kyzivat, P., Perkins, C., &amp; Handley, M. (2021). </w:t>
+      </w:r>
+      <w:r>
+        <w:rPr>
+          <w:i w:val="1"/>
+          <w:iCs w:val="1"/>
+          <w:sz w:val="22"/>
+          <w:szCs w:val="22"/>
+          <w:rtl w:val="0"/>
+        </w:rPr>
+        <w:t xml:space="preserve">SDP: Session Description Protocol (Request for Comments 8866)</w:t>
+      </w:r>
+      <w:r>
+        <w:rPr>
+          <w:sz w:val="22"/>
+          <w:szCs w:val="22"/>
+          <w:rtl w:val="0"/>
+        </w:rPr>
+        <w:t xml:space="preserve">.</w:t>
       </w:r>
       <w:hyperlink r:id="rId27">
         <w:r>
@@ -14986,7 +15457,7 @@
             <w:szCs w:val="22"/>
             <w:rtl w:val="0"/>
           </w:rPr>
-          <w:t xml:space="preserve">https://urn.nsk.hr/urn:nbn:hr:228:949522</w:t>
+          <w:t xml:space="preserve"> https://www.rfc-editor.org/info/rfc8866</w:t>
         </w:r>
       </w:hyperlink>
       <w:r>
@@ -14995,7 +15466,7 @@
         </w:rPr>
       </w:r>
     </w:p>
-    <w:bookmarkStart w:colFirst="0" w:colLast="0" w:name="771efax98nz4" w:id="39"/>
+    <w:bookmarkStart w:colFirst="0" w:colLast="0" w:name="wlaein5832zi" w:id="39"/>
     <w:bookmarkEnd w:id="39"/>
     <w:p>
       <w:pPr>
@@ -15015,7 +15486,25 @@
           <w:szCs w:val="22"/>
           <w:rtl w:val="0"/>
         </w:rPr>
-        <w:t xml:space="preserve">Rescorla, E., &amp; Modadugu, N. (2012). Datagram Transport Layer Security Version 1.2 (RFC 6347). </w:t>
+        <w:t xml:space="preserve">Keranen, A., Holmberg, C., &amp; Rosenberg, J. (2018). </w:t>
+      </w:r>
+      <w:r>
+        <w:rPr>
+          <w:i w:val="1"/>
+          <w:iCs w:val="1"/>
+          <w:sz w:val="22"/>
+          <w:szCs w:val="22"/>
+          <w:rtl w:val="0"/>
+        </w:rPr>
+        <w:t xml:space="preserve">Interactive Connectivity Establishment (ICE): A Protocol for Network Address Translator (NAT) Traversal (Request for Comments 8445)</w:t>
+      </w:r>
+      <w:r>
+        <w:rPr>
+          <w:sz w:val="22"/>
+          <w:szCs w:val="22"/>
+          <w:rtl w:val="0"/>
+        </w:rPr>
+        <w:t xml:space="preserve">.</w:t>
       </w:r>
       <w:hyperlink r:id="rId28">
         <w:r>
@@ -15024,7 +15513,7 @@
             <w:szCs w:val="22"/>
             <w:rtl w:val="0"/>
           </w:rPr>
-          <w:t xml:space="preserve">https://datatracker.ietf.org/doc/html/rfc6347</w:t>
+          <w:t xml:space="preserve"> https://www.rfc-editor.org/info/rfc8445</w:t>
         </w:r>
       </w:hyperlink>
       <w:r>
@@ -15033,7 +15522,7 @@
         </w:rPr>
       </w:r>
     </w:p>
-    <w:bookmarkStart w:colFirst="0" w:colLast="0" w:name="3elz847hzigg" w:id="40"/>
+    <w:bookmarkStart w:colFirst="0" w:colLast="0" w:name="ijst93fwutj" w:id="40"/>
     <w:bookmarkEnd w:id="40"/>
     <w:p>
       <w:pPr>
@@ -15053,7 +15542,25 @@
           <w:szCs w:val="22"/>
           <w:rtl w:val="0"/>
         </w:rPr>
-        <w:t xml:space="preserve">Rescorla, E., et al. (2022). The WebRTC Security Architecture (RFC 9143). </w:t>
+        <w:t xml:space="preserve">Petit-Huguenin, M., Salgueiro, G., Rosenberg, J., Wing, D., Mahy, R., &amp; Matthews, P. (2020). </w:t>
+      </w:r>
+      <w:r>
+        <w:rPr>
+          <w:i w:val="1"/>
+          <w:iCs w:val="1"/>
+          <w:sz w:val="22"/>
+          <w:szCs w:val="22"/>
+          <w:rtl w:val="0"/>
+        </w:rPr>
+        <w:t xml:space="preserve">Session Traversal Utilities for NAT (STUN) (Request for Comments 8489)</w:t>
+      </w:r>
+      <w:r>
+        <w:rPr>
+          <w:sz w:val="22"/>
+          <w:szCs w:val="22"/>
+          <w:rtl w:val="0"/>
+        </w:rPr>
+        <w:t xml:space="preserve">.</w:t>
       </w:r>
       <w:hyperlink r:id="rId29">
         <w:r>
@@ -15062,7 +15569,7 @@
             <w:szCs w:val="22"/>
             <w:rtl w:val="0"/>
           </w:rPr>
-          <w:t xml:space="preserve">https://datatracker.ietf.org/doc/html/rfc9143</w:t>
+          <w:t xml:space="preserve"> https://www.rfc-editor.org/info/rfc8489</w:t>
         </w:r>
       </w:hyperlink>
       <w:r>
@@ -15071,7 +15578,7 @@
         </w:rPr>
       </w:r>
     </w:p>
-    <w:bookmarkStart w:colFirst="0" w:colLast="0" w:name="u10sn56o268o" w:id="41"/>
+    <w:bookmarkStart w:colFirst="0" w:colLast="0" w:name="8ox9rrfefkwv" w:id="41"/>
     <w:bookmarkEnd w:id="41"/>
     <w:p>
       <w:pPr>
@@ -15091,7 +15598,25 @@
           <w:szCs w:val="22"/>
           <w:rtl w:val="0"/>
         </w:rPr>
-        <w:t xml:space="preserve">Rosenberg, J., Mahy, R., &amp; Wing, D. (2010). Interactive Connectivity Establishment (ICE) (RFC 5245). </w:t>
+        <w:t xml:space="preserve">Reddy, T. (Editor), Johnston, A. (Editor), Matthews, P., &amp; Rosenberg, J. (2020). </w:t>
+      </w:r>
+      <w:r>
+        <w:rPr>
+          <w:i w:val="1"/>
+          <w:iCs w:val="1"/>
+          <w:sz w:val="22"/>
+          <w:szCs w:val="22"/>
+          <w:rtl w:val="0"/>
+        </w:rPr>
+        <w:t xml:space="preserve">Traversal Using Relays around NAT (TURN): Relay Extensions to Session Traversal Utilities for NAT (STUN) (Request for Comments 8656)</w:t>
+      </w:r>
+      <w:r>
+        <w:rPr>
+          <w:sz w:val="22"/>
+          <w:szCs w:val="22"/>
+          <w:rtl w:val="0"/>
+        </w:rPr>
+        <w:t xml:space="preserve">.</w:t>
       </w:r>
       <w:hyperlink r:id="rId30">
         <w:r>
@@ -15100,7 +15625,7 @@
             <w:szCs w:val="22"/>
             <w:rtl w:val="0"/>
           </w:rPr>
-          <w:t xml:space="preserve">https://datatracker.ietf.org/doc/html/rfc5245</w:t>
+          <w:t xml:space="preserve"> https://www.rfc-editor.org/info/rfc8656</w:t>
         </w:r>
       </w:hyperlink>
       <w:r>
@@ -15109,7 +15634,7 @@
         </w:rPr>
       </w:r>
     </w:p>
-    <w:bookmarkStart w:colFirst="0" w:colLast="0" w:name="tboo8a6eh01h" w:id="42"/>
+    <w:bookmarkStart w:colFirst="0" w:colLast="0" w:name="7z2s14o39gn0" w:id="42"/>
     <w:bookmarkEnd w:id="42"/>
     <w:p>
       <w:pPr>
@@ -15129,7 +15654,25 @@
           <w:szCs w:val="22"/>
           <w:rtl w:val="0"/>
         </w:rPr>
-        <w:t xml:space="preserve">Rosenberg, J., Mahy, R., Matthews, P., &amp; Wing, D. (2010). Session Traversal Utilities for NAT (STUN) (RFC 5389). </w:t>
+        <w:t xml:space="preserve">Rescorla, E., Tschofenig, H., &amp; Modadugu, N. (2022). </w:t>
+      </w:r>
+      <w:r>
+        <w:rPr>
+          <w:i w:val="1"/>
+          <w:iCs w:val="1"/>
+          <w:sz w:val="22"/>
+          <w:szCs w:val="22"/>
+          <w:rtl w:val="0"/>
+        </w:rPr>
+        <w:t xml:space="preserve">Datagram Transport Layer Security (DTLS) Protocol Version 1.3 (Request for Comments 9147)</w:t>
+      </w:r>
+      <w:r>
+        <w:rPr>
+          <w:sz w:val="22"/>
+          <w:szCs w:val="22"/>
+          <w:rtl w:val="0"/>
+        </w:rPr>
+        <w:t xml:space="preserve">.</w:t>
       </w:r>
       <w:hyperlink r:id="rId31">
         <w:r>
@@ -15138,7 +15681,7 @@
             <w:szCs w:val="22"/>
             <w:rtl w:val="0"/>
           </w:rPr>
-          <w:t xml:space="preserve">https://datatracker.ietf.org/doc/html/rfc5389</w:t>
+          <w:t xml:space="preserve"> https://www.rfc-editor.org/info/rfc9147</w:t>
         </w:r>
       </w:hyperlink>
       <w:r>
@@ -15147,7 +15690,7 @@
         </w:rPr>
       </w:r>
     </w:p>
-    <w:bookmarkStart w:colFirst="0" w:colLast="0" w:name="owyroi7qj1u8" w:id="43"/>
+    <w:bookmarkStart w:colFirst="0" w:colLast="0" w:name="h66rjy8hg6ti" w:id="43"/>
     <w:bookmarkEnd w:id="43"/>
     <w:p>
       <w:pPr>
@@ -15167,7 +15710,25 @@
           <w:szCs w:val="22"/>
           <w:rtl w:val="0"/>
         </w:rPr>
-        <w:t xml:space="preserve">Schulzrinne, H., Casner, S., Frederick, R., &amp; Jacobson, V. (2003). RTP: A Transport Protocol for Real-Time Applications (RFC 3550). </w:t>
+        <w:t xml:space="preserve">Baugher, M., McGrew, D., Naslund, M., Carrara, E., &amp; Norrman, K. (2004). </w:t>
+      </w:r>
+      <w:r>
+        <w:rPr>
+          <w:i w:val="1"/>
+          <w:iCs w:val="1"/>
+          <w:sz w:val="22"/>
+          <w:szCs w:val="22"/>
+          <w:rtl w:val="0"/>
+        </w:rPr>
+        <w:t xml:space="preserve">The Secure Real-time Transport Protocol (SRTP) (Request for Comments 3711)</w:t>
+      </w:r>
+      <w:r>
+        <w:rPr>
+          <w:sz w:val="22"/>
+          <w:szCs w:val="22"/>
+          <w:rtl w:val="0"/>
+        </w:rPr>
+        <w:t xml:space="preserve">.</w:t>
       </w:r>
       <w:hyperlink r:id="rId32">
         <w:r>
@@ -15176,7 +15737,7 @@
             <w:szCs w:val="22"/>
             <w:rtl w:val="0"/>
           </w:rPr>
-          <w:t xml:space="preserve">https://datatracker.ietf.org/doc/html/rfc3550</w:t>
+          <w:t xml:space="preserve"> https://www.rfc-editor.org/info/rfc3711</w:t>
         </w:r>
       </w:hyperlink>
       <w:r>
@@ -15185,7 +15746,7 @@
         </w:rPr>
       </w:r>
     </w:p>
-    <w:bookmarkStart w:colFirst="0" w:colLast="0" w:name="pubx4x9yx3oz" w:id="44"/>
+    <w:bookmarkStart w:colFirst="0" w:colLast="0" w:name="xm6ic1nmesg1" w:id="44"/>
     <w:bookmarkEnd w:id="44"/>
     <w:p>
       <w:pPr>
@@ -15205,7 +15766,25 @@
           <w:szCs w:val="22"/>
           <w:rtl w:val="0"/>
         </w:rPr>
-        <w:t xml:space="preserve">Stewart, R. (2007). Stream Control Transmission Protocol (RFC 4960). </w:t>
+        <w:t xml:space="preserve">Fischl, J., Tschofenig, H., &amp; Rescorla, E. (2010). </w:t>
+      </w:r>
+      <w:r>
+        <w:rPr>
+          <w:i w:val="1"/>
+          <w:iCs w:val="1"/>
+          <w:sz w:val="22"/>
+          <w:szCs w:val="22"/>
+          <w:rtl w:val="0"/>
+        </w:rPr>
+        <w:t xml:space="preserve">Framework for Establishing a Secure Real-time Transport Protocol (SRTP) Security Context Using Datagram Transport Layer Security (DTLS) (Request for Comments 5763)</w:t>
+      </w:r>
+      <w:r>
+        <w:rPr>
+          <w:sz w:val="22"/>
+          <w:szCs w:val="22"/>
+          <w:rtl w:val="0"/>
+        </w:rPr>
+        <w:t xml:space="preserve">.</w:t>
       </w:r>
       <w:hyperlink r:id="rId33">
         <w:r>
@@ -15214,16 +15793,26 @@
             <w:szCs w:val="22"/>
             <w:rtl w:val="0"/>
           </w:rPr>
-          <w:t xml:space="preserve">https://datatracker.ietf.org/doc/html/rfc4960</w:t>
+          <w:t xml:space="preserve"> </w:t>
         </w:r>
       </w:hyperlink>
+      <w:hyperlink r:id="rId34">
+        <w:r>
+          <w:rPr>
+            <w:sz w:val="22"/>
+            <w:szCs w:val="22"/>
+            <w:rtl w:val="0"/>
+          </w:rPr>
+          <w:t xml:space="preserve">https://www.rfc-editor.org/info/rfc5763</w:t>
+        </w:r>
+      </w:hyperlink>
       <w:r>
         <w:rPr>
           <w:rtl w:val="0"/>
         </w:rPr>
       </w:r>
     </w:p>
-    <w:bookmarkStart w:colFirst="0" w:colLast="0" w:name="x501v9ofrj6a" w:id="45"/>
+    <w:bookmarkStart w:colFirst="0" w:colLast="0" w:name="ykt0183k3jp" w:id="45"/>
     <w:bookmarkEnd w:id="45"/>
     <w:p>
       <w:pPr>
@@ -15243,16 +15832,34 @@
           <w:szCs w:val="22"/>
           <w:rtl w:val="0"/>
         </w:rPr>
-        <w:t xml:space="preserve">Uberti, J., Jennings, C., &amp; Rescorla, E. (2024). JavaScript Session Establishment Protocol (JSEP) (RFC 9429). </w:t>
-      </w:r>
-      <w:hyperlink r:id="rId34">
+        <w:t xml:space="preserve">Schulzrinne, H., Casner, S., Frederick, R., &amp; Jacobson, V. (2003). </w:t>
+      </w:r>
+      <w:r>
+        <w:rPr>
+          <w:i w:val="1"/>
+          <w:iCs w:val="1"/>
+          <w:sz w:val="22"/>
+          <w:szCs w:val="22"/>
+          <w:rtl w:val="0"/>
+        </w:rPr>
+        <w:t xml:space="preserve">RTP: A Transport Protocol for Real-Time Applications (Request for Comments 3550)</w:t>
+      </w:r>
+      <w:r>
+        <w:rPr>
+          <w:sz w:val="22"/>
+          <w:szCs w:val="22"/>
+          <w:rtl w:val="0"/>
+        </w:rPr>
+        <w:t xml:space="preserve">.</w:t>
+      </w:r>
+      <w:hyperlink r:id="rId35">
         <w:r>
           <w:rPr>
             <w:sz w:val="22"/>
             <w:szCs w:val="22"/>
             <w:rtl w:val="0"/>
           </w:rPr>
-          <w:t xml:space="preserve">https://datatracker.ietf.org/doc/html/rfc9429</w:t>
+          <w:t xml:space="preserve"> https://www.rfc-editor.org/info/rfc3550</w:t>
         </w:r>
       </w:hyperlink>
       <w:r>
@@ -15261,7 +15868,7 @@
         </w:rPr>
       </w:r>
     </w:p>
-    <w:bookmarkStart w:colFirst="0" w:colLast="0" w:name="436lt588xhm" w:id="46"/>
+    <w:bookmarkStart w:colFirst="0" w:colLast="0" w:name="f631p3nhuc8t" w:id="46"/>
     <w:bookmarkEnd w:id="46"/>
     <w:p>
       <w:pPr>
@@ -15281,16 +15888,34 @@
           <w:szCs w:val="22"/>
           <w:rtl w:val="0"/>
         </w:rPr>
-        <w:t xml:space="preserve">W3C. (2025). WebRTC: Real-Time Communication in Browsers (Recommendation). </w:t>
-      </w:r>
-      <w:hyperlink r:id="rId35">
+        <w:t xml:space="preserve">Stewart, R., Tüxen, M., &amp; Nielsen, K. (2022). </w:t>
+      </w:r>
+      <w:r>
+        <w:rPr>
+          <w:i w:val="1"/>
+          <w:iCs w:val="1"/>
+          <w:sz w:val="22"/>
+          <w:szCs w:val="22"/>
+          <w:rtl w:val="0"/>
+        </w:rPr>
+        <w:t xml:space="preserve">Stream Control Transmission Protocol (Request for Comments 9260)</w:t>
+      </w:r>
+      <w:r>
+        <w:rPr>
+          <w:sz w:val="22"/>
+          <w:szCs w:val="22"/>
+          <w:rtl w:val="0"/>
+        </w:rPr>
+        <w:t xml:space="preserve">.</w:t>
+      </w:r>
+      <w:hyperlink r:id="rId36">
         <w:r>
           <w:rPr>
             <w:sz w:val="22"/>
             <w:szCs w:val="22"/>
             <w:rtl w:val="0"/>
           </w:rPr>
-          <w:t xml:space="preserve">https://www.w3.org/TR/webrtc/</w:t>
+          <w:t xml:space="preserve"> https://www.rfc-editor.org/info/rfc9260</w:t>
         </w:r>
       </w:hyperlink>
       <w:r>
@@ -15299,7 +15924,7 @@
         </w:rPr>
       </w:r>
     </w:p>
-    <w:bookmarkStart w:colFirst="0" w:colLast="0" w:name="l22jq4gzf9bv" w:id="47"/>
+    <w:bookmarkStart w:colFirst="0" w:colLast="0" w:name="57rv0g9tdapp" w:id="47"/>
     <w:bookmarkEnd w:id="47"/>
     <w:p>
       <w:pPr>
@@ -15319,35 +15944,92 @@
           <w:szCs w:val="22"/>
           <w:rtl w:val="0"/>
         </w:rPr>
-        <w:t xml:space="preserve">Westerlund, M., &amp; Lundin, H. (2015). RTP Topologies (RFC 7667). </w:t>
-      </w:r>
-      <w:hyperlink r:id="rId36">
+        <w:t xml:space="preserve">Papić, A. (2026). </w:t>
+      </w:r>
+      <w:r>
+        <w:rPr>
+          <w:i w:val="1"/>
+          <w:iCs w:val="1"/>
+          <w:sz w:val="22"/>
+          <w:szCs w:val="22"/>
+          <w:rtl w:val="0"/>
+        </w:rPr>
+        <w:t xml:space="preserve">Razvoj web aplikacije za repeticije</w:t>
+      </w:r>
+      <w:r>
+        <w:rPr>
+          <w:sz w:val="22"/>
+          <w:szCs w:val="22"/>
+          <w:rtl w:val="0"/>
+        </w:rPr>
+        <w:t xml:space="preserve"> (Diplomski rad). Sveučilište u Splitu, Sveučilišni odjel za stručne studije, Split.</w:t>
+      </w:r>
+      <w:hyperlink r:id="rId37">
         <w:r>
           <w:rPr>
             <w:sz w:val="22"/>
             <w:szCs w:val="22"/>
             <w:rtl w:val="0"/>
           </w:rPr>
-          <w:t xml:space="preserve">https://datatracker.ietf.org/doc/html/rfc7667</w:t>
+          <w:t xml:space="preserve"> https://urn.nsk.hr/urn:nbn:hr:228:949522</w:t>
         </w:r>
       </w:hyperlink>
       <w:r>
         <w:rPr>
-          <w:sz w:val="22"/>
-          <w:szCs w:val="22"/>
-          <w:rtl w:val="0"/>
-        </w:rPr>
-        <w:t xml:space="preserve"> </w:t>
+          <w:rtl w:val="0"/>
+        </w:rPr>
       </w:r>
     </w:p>
+    <w:bookmarkStart w:colFirst="0" w:colLast="0" w:name="4dgqvvezbdt1" w:id="48"/>
+    <w:bookmarkEnd w:id="48"/>
     <w:p>
       <w:pPr>
-        <w:ind w:firstLine="0"/>
+        <w:numPr>
+          <w:ilvl w:val="0"/>
+          <w:numId w:val="1"/>
+        </w:numPr>
+        <w:ind w:left="720" w:hanging="360"/>
         <w:rPr>
           <w:sz w:val="22"/>
           <w:szCs w:val="22"/>
         </w:rPr>
       </w:pPr>
+      <w:r>
+        <w:rPr>
+          <w:sz w:val="22"/>
+          <w:szCs w:val="22"/>
+          <w:rtl w:val="0"/>
+        </w:rPr>
+        <w:t xml:space="preserve">Uberti, J., Jennings, C., &amp; Rescorla, E. (Editor). (2024). </w:t>
+      </w:r>
+      <w:r>
+        <w:rPr>
+          <w:i w:val="1"/>
+          <w:iCs w:val="1"/>
+          <w:sz w:val="22"/>
+          <w:szCs w:val="22"/>
+          <w:rtl w:val="0"/>
+        </w:rPr>
+        <w:t xml:space="preserve">JavaScript Session Establishment Protocol (JSEP) (Request for Comments 9429)</w:t>
+      </w:r>
+      <w:r>
+        <w:rPr>
+          <w:sz w:val="22"/>
+          <w:szCs w:val="22"/>
+          <w:rtl w:val="0"/>
+        </w:rPr>
+        <w:t xml:space="preserve">.</w:t>
+      </w:r>
+      <w:hyperlink r:id="rId38">
+        <w:r>
+          <w:rPr>
+            <w:sz w:val="22"/>
+            <w:szCs w:val="22"/>
+            <w:rtl w:val="0"/>
+          </w:rPr>
+          <w:t xml:space="preserve"> https://www.rfc-editor.org/info/rfc9429</w:t>
+        </w:r>
+      </w:hyperlink>
       <w:r>
         <w:rPr>
           <w:rtl w:val="0"/>
@@ -15355,7 +16037,7 @@
       </w:r>
     </w:p>
     <w:sectPr>
-      <w:headerReference r:id="rId37" w:type="even"/>
+      <w:headerReference r:id="rId39" w:type="even"/>
       <w:pgSz w:h="16840" w:w="11907" w:orient="portrait"/>
       <w:pgMar w:bottom="1134" w:top="1701" w:left="1418" w:right="1418" w:header="907" w:footer="567"/>
       <w:pgNumType w:start="1"/>

</xml_diff>